<commit_message>
12th commit: updated grateful
</commit_message>
<xml_diff>
--- a/report_sources/grateful-report.docx
+++ b/report_sources/grateful-report.docx
@@ -128,19 +128,19 @@
               <w:jc w:val="left"/>
             </w:pPr>
             <w:r>
-              <w:t xml:space="preserve">epiDisplay</w:t>
-            </w:r>
-          </w:p>
-        </w:tc>
-        <w:tc>
-          <w:tcPr/>
-          <w:p>
-            <w:pPr>
-              <w:pStyle w:val="Compact"/>
-              <w:jc w:val="left"/>
-            </w:pPr>
-            <w:r>
-              <w:t xml:space="preserve">3.5.0.2</w:t>
+              <w:t xml:space="preserve">coin</w:t>
+            </w:r>
+          </w:p>
+        </w:tc>
+        <w:tc>
+          <w:tcPr/>
+          <w:p>
+            <w:pPr>
+              <w:pStyle w:val="Compact"/>
+              <w:jc w:val="left"/>
+            </w:pPr>
+            <w:r>
+              <w:t xml:space="preserve">1.4.3</w:t>
             </w:r>
           </w:p>
         </w:tc>
@@ -153,6 +153,15 @@
             </w:pPr>
             <w:r>
               <w:t xml:space="preserve">(2)</w:t>
+            </w:r>
+            <w:r>
+              <w:t xml:space="preserve">;</w:t>
+            </w:r>
+            <w:r>
+              <w:t xml:space="preserve"> </w:t>
+            </w:r>
+            <w:r>
+              <w:t xml:space="preserve">(3)</w:t>
             </w:r>
           </w:p>
         </w:tc>
@@ -166,31 +175,31 @@
               <w:jc w:val="left"/>
             </w:pPr>
             <w:r>
-              <w:t xml:space="preserve">factoextra</w:t>
-            </w:r>
-          </w:p>
-        </w:tc>
-        <w:tc>
-          <w:tcPr/>
-          <w:p>
-            <w:pPr>
-              <w:pStyle w:val="Compact"/>
-              <w:jc w:val="left"/>
-            </w:pPr>
-            <w:r>
-              <w:t xml:space="preserve">1.0.7</w:t>
-            </w:r>
-          </w:p>
-        </w:tc>
-        <w:tc>
-          <w:tcPr/>
-          <w:p>
-            <w:pPr>
-              <w:pStyle w:val="Compact"/>
-              <w:jc w:val="left"/>
-            </w:pPr>
-            <w:r>
-              <w:t xml:space="preserve">(3)</w:t>
+              <w:t xml:space="preserve">eulerr</w:t>
+            </w:r>
+          </w:p>
+        </w:tc>
+        <w:tc>
+          <w:tcPr/>
+          <w:p>
+            <w:pPr>
+              <w:pStyle w:val="Compact"/>
+              <w:jc w:val="left"/>
+            </w:pPr>
+            <w:r>
+              <w:t xml:space="preserve">7.1.0</w:t>
+            </w:r>
+          </w:p>
+        </w:tc>
+        <w:tc>
+          <w:tcPr/>
+          <w:p>
+            <w:pPr>
+              <w:pStyle w:val="Compact"/>
+              <w:jc w:val="left"/>
+            </w:pPr>
+            <w:r>
+              <w:t xml:space="preserve">(4)</w:t>
             </w:r>
           </w:p>
         </w:tc>
@@ -204,31 +213,31 @@
               <w:jc w:val="left"/>
             </w:pPr>
             <w:r>
-              <w:t xml:space="preserve">finalfit</w:t>
-            </w:r>
-          </w:p>
-        </w:tc>
-        <w:tc>
-          <w:tcPr/>
-          <w:p>
-            <w:pPr>
-              <w:pStyle w:val="Compact"/>
-              <w:jc w:val="left"/>
-            </w:pPr>
-            <w:r>
-              <w:t xml:space="preserve">1.0.8</w:t>
-            </w:r>
-          </w:p>
-        </w:tc>
-        <w:tc>
-          <w:tcPr/>
-          <w:p>
-            <w:pPr>
-              <w:pStyle w:val="Compact"/>
-              <w:jc w:val="left"/>
-            </w:pPr>
-            <w:r>
-              <w:t xml:space="preserve">(4)</w:t>
+              <w:t xml:space="preserve">factoextra</w:t>
+            </w:r>
+          </w:p>
+        </w:tc>
+        <w:tc>
+          <w:tcPr/>
+          <w:p>
+            <w:pPr>
+              <w:pStyle w:val="Compact"/>
+              <w:jc w:val="left"/>
+            </w:pPr>
+            <w:r>
+              <w:t xml:space="preserve">1.0.7</w:t>
+            </w:r>
+          </w:p>
+        </w:tc>
+        <w:tc>
+          <w:tcPr/>
+          <w:p>
+            <w:pPr>
+              <w:pStyle w:val="Compact"/>
+              <w:jc w:val="left"/>
+            </w:pPr>
+            <w:r>
+              <w:t xml:space="preserve">(5)</w:t>
             </w:r>
           </w:p>
         </w:tc>
@@ -242,31 +251,31 @@
               <w:jc w:val="left"/>
             </w:pPr>
             <w:r>
-              <w:t xml:space="preserve">flextable</w:t>
-            </w:r>
-          </w:p>
-        </w:tc>
-        <w:tc>
-          <w:tcPr/>
-          <w:p>
-            <w:pPr>
-              <w:pStyle w:val="Compact"/>
-              <w:jc w:val="left"/>
-            </w:pPr>
-            <w:r>
-              <w:t xml:space="preserve">0.9.9</w:t>
-            </w:r>
-          </w:p>
-        </w:tc>
-        <w:tc>
-          <w:tcPr/>
-          <w:p>
-            <w:pPr>
-              <w:pStyle w:val="Compact"/>
-              <w:jc w:val="left"/>
-            </w:pPr>
-            <w:r>
-              <w:t xml:space="preserve">(5)</w:t>
+              <w:t xml:space="preserve">finalfit</w:t>
+            </w:r>
+          </w:p>
+        </w:tc>
+        <w:tc>
+          <w:tcPr/>
+          <w:p>
+            <w:pPr>
+              <w:pStyle w:val="Compact"/>
+              <w:jc w:val="left"/>
+            </w:pPr>
+            <w:r>
+              <w:t xml:space="preserve">1.0.8</w:t>
+            </w:r>
+          </w:p>
+        </w:tc>
+        <w:tc>
+          <w:tcPr/>
+          <w:p>
+            <w:pPr>
+              <w:pStyle w:val="Compact"/>
+              <w:jc w:val="left"/>
+            </w:pPr>
+            <w:r>
+              <w:t xml:space="preserve">(6)</w:t>
             </w:r>
           </w:p>
         </w:tc>
@@ -280,31 +289,31 @@
               <w:jc w:val="left"/>
             </w:pPr>
             <w:r>
-              <w:t xml:space="preserve">ggeffects</w:t>
-            </w:r>
-          </w:p>
-        </w:tc>
-        <w:tc>
-          <w:tcPr/>
-          <w:p>
-            <w:pPr>
-              <w:pStyle w:val="Compact"/>
-              <w:jc w:val="left"/>
-            </w:pPr>
-            <w:r>
-              <w:t xml:space="preserve">2.3.1</w:t>
-            </w:r>
-          </w:p>
-        </w:tc>
-        <w:tc>
-          <w:tcPr/>
-          <w:p>
-            <w:pPr>
-              <w:pStyle w:val="Compact"/>
-              <w:jc w:val="left"/>
-            </w:pPr>
-            <w:r>
-              <w:t xml:space="preserve">(6)</w:t>
+              <w:t xml:space="preserve">flextable</w:t>
+            </w:r>
+          </w:p>
+        </w:tc>
+        <w:tc>
+          <w:tcPr/>
+          <w:p>
+            <w:pPr>
+              <w:pStyle w:val="Compact"/>
+              <w:jc w:val="left"/>
+            </w:pPr>
+            <w:r>
+              <w:t xml:space="preserve">0.9.9</w:t>
+            </w:r>
+          </w:p>
+        </w:tc>
+        <w:tc>
+          <w:tcPr/>
+          <w:p>
+            <w:pPr>
+              <w:pStyle w:val="Compact"/>
+              <w:jc w:val="left"/>
+            </w:pPr>
+            <w:r>
+              <w:t xml:space="preserve">(7)</w:t>
             </w:r>
           </w:p>
         </w:tc>
@@ -318,31 +327,31 @@
               <w:jc w:val="left"/>
             </w:pPr>
             <w:r>
-              <w:t xml:space="preserve">ggpubr</w:t>
-            </w:r>
-          </w:p>
-        </w:tc>
-        <w:tc>
-          <w:tcPr/>
-          <w:p>
-            <w:pPr>
-              <w:pStyle w:val="Compact"/>
-              <w:jc w:val="left"/>
-            </w:pPr>
-            <w:r>
-              <w:t xml:space="preserve">0.6.1</w:t>
-            </w:r>
-          </w:p>
-        </w:tc>
-        <w:tc>
-          <w:tcPr/>
-          <w:p>
-            <w:pPr>
-              <w:pStyle w:val="Compact"/>
-              <w:jc w:val="left"/>
-            </w:pPr>
-            <w:r>
-              <w:t xml:space="preserve">(7)</w:t>
+              <w:t xml:space="preserve">FSA</w:t>
+            </w:r>
+          </w:p>
+        </w:tc>
+        <w:tc>
+          <w:tcPr/>
+          <w:p>
+            <w:pPr>
+              <w:pStyle w:val="Compact"/>
+              <w:jc w:val="left"/>
+            </w:pPr>
+            <w:r>
+              <w:t xml:space="preserve">0.10.1</w:t>
+            </w:r>
+          </w:p>
+        </w:tc>
+        <w:tc>
+          <w:tcPr/>
+          <w:p>
+            <w:pPr>
+              <w:pStyle w:val="Compact"/>
+              <w:jc w:val="left"/>
+            </w:pPr>
+            <w:r>
+              <w:t xml:space="preserve">(8)</w:t>
             </w:r>
           </w:p>
         </w:tc>
@@ -356,31 +365,31 @@
               <w:jc w:val="left"/>
             </w:pPr>
             <w:r>
-              <w:t xml:space="preserve">ggtext</w:t>
-            </w:r>
-          </w:p>
-        </w:tc>
-        <w:tc>
-          <w:tcPr/>
-          <w:p>
-            <w:pPr>
-              <w:pStyle w:val="Compact"/>
-              <w:jc w:val="left"/>
-            </w:pPr>
-            <w:r>
-              <w:t xml:space="preserve">0.1.2</w:t>
-            </w:r>
-          </w:p>
-        </w:tc>
-        <w:tc>
-          <w:tcPr/>
-          <w:p>
-            <w:pPr>
-              <w:pStyle w:val="Compact"/>
-              <w:jc w:val="left"/>
-            </w:pPr>
-            <w:r>
-              <w:t xml:space="preserve">(8)</w:t>
+              <w:t xml:space="preserve">ggeffects</w:t>
+            </w:r>
+          </w:p>
+        </w:tc>
+        <w:tc>
+          <w:tcPr/>
+          <w:p>
+            <w:pPr>
+              <w:pStyle w:val="Compact"/>
+              <w:jc w:val="left"/>
+            </w:pPr>
+            <w:r>
+              <w:t xml:space="preserve">2.3.1</w:t>
+            </w:r>
+          </w:p>
+        </w:tc>
+        <w:tc>
+          <w:tcPr/>
+          <w:p>
+            <w:pPr>
+              <w:pStyle w:val="Compact"/>
+              <w:jc w:val="left"/>
+            </w:pPr>
+            <w:r>
+              <w:t xml:space="preserve">(9)</w:t>
             </w:r>
           </w:p>
         </w:tc>
@@ -394,31 +403,31 @@
               <w:jc w:val="left"/>
             </w:pPr>
             <w:r>
-              <w:t xml:space="preserve">gtsummary</w:t>
-            </w:r>
-          </w:p>
-        </w:tc>
-        <w:tc>
-          <w:tcPr/>
-          <w:p>
-            <w:pPr>
-              <w:pStyle w:val="Compact"/>
-              <w:jc w:val="left"/>
-            </w:pPr>
-            <w:r>
-              <w:t xml:space="preserve">2.3.0</w:t>
-            </w:r>
-          </w:p>
-        </w:tc>
-        <w:tc>
-          <w:tcPr/>
-          <w:p>
-            <w:pPr>
-              <w:pStyle w:val="Compact"/>
-              <w:jc w:val="left"/>
-            </w:pPr>
-            <w:r>
-              <w:t xml:space="preserve">(9)</w:t>
+              <w:t xml:space="preserve">ggpubr</w:t>
+            </w:r>
+          </w:p>
+        </w:tc>
+        <w:tc>
+          <w:tcPr/>
+          <w:p>
+            <w:pPr>
+              <w:pStyle w:val="Compact"/>
+              <w:jc w:val="left"/>
+            </w:pPr>
+            <w:r>
+              <w:t xml:space="preserve">0.6.1</w:t>
+            </w:r>
+          </w:p>
+        </w:tc>
+        <w:tc>
+          <w:tcPr/>
+          <w:p>
+            <w:pPr>
+              <w:pStyle w:val="Compact"/>
+              <w:jc w:val="left"/>
+            </w:pPr>
+            <w:r>
+              <w:t xml:space="preserve">(10)</w:t>
             </w:r>
           </w:p>
         </w:tc>
@@ -432,31 +441,31 @@
               <w:jc w:val="left"/>
             </w:pPr>
             <w:r>
-              <w:t xml:space="preserve">here</w:t>
-            </w:r>
-          </w:p>
-        </w:tc>
-        <w:tc>
-          <w:tcPr/>
-          <w:p>
-            <w:pPr>
-              <w:pStyle w:val="Compact"/>
-              <w:jc w:val="left"/>
-            </w:pPr>
-            <w:r>
-              <w:t xml:space="preserve">1.0.1</w:t>
-            </w:r>
-          </w:p>
-        </w:tc>
-        <w:tc>
-          <w:tcPr/>
-          <w:p>
-            <w:pPr>
-              <w:pStyle w:val="Compact"/>
-              <w:jc w:val="left"/>
-            </w:pPr>
-            <w:r>
-              <w:t xml:space="preserve">(10)</w:t>
+              <w:t xml:space="preserve">ggsci</w:t>
+            </w:r>
+          </w:p>
+        </w:tc>
+        <w:tc>
+          <w:tcPr/>
+          <w:p>
+            <w:pPr>
+              <w:pStyle w:val="Compact"/>
+              <w:jc w:val="left"/>
+            </w:pPr>
+            <w:r>
+              <w:t xml:space="preserve">3.2.0</w:t>
+            </w:r>
+          </w:p>
+        </w:tc>
+        <w:tc>
+          <w:tcPr/>
+          <w:p>
+            <w:pPr>
+              <w:pStyle w:val="Compact"/>
+              <w:jc w:val="left"/>
+            </w:pPr>
+            <w:r>
+              <w:t xml:space="preserve">(11)</w:t>
             </w:r>
           </w:p>
         </w:tc>
@@ -470,31 +479,31 @@
               <w:jc w:val="left"/>
             </w:pPr>
             <w:r>
-              <w:t xml:space="preserve">Hmisc</w:t>
-            </w:r>
-          </w:p>
-        </w:tc>
-        <w:tc>
-          <w:tcPr/>
-          <w:p>
-            <w:pPr>
-              <w:pStyle w:val="Compact"/>
-              <w:jc w:val="left"/>
-            </w:pPr>
-            <w:r>
-              <w:t xml:space="preserve">5.2.4</w:t>
-            </w:r>
-          </w:p>
-        </w:tc>
-        <w:tc>
-          <w:tcPr/>
-          <w:p>
-            <w:pPr>
-              <w:pStyle w:val="Compact"/>
-              <w:jc w:val="left"/>
-            </w:pPr>
-            <w:r>
-              <w:t xml:space="preserve">(11)</w:t>
+              <w:t xml:space="preserve">ggtext</w:t>
+            </w:r>
+          </w:p>
+        </w:tc>
+        <w:tc>
+          <w:tcPr/>
+          <w:p>
+            <w:pPr>
+              <w:pStyle w:val="Compact"/>
+              <w:jc w:val="left"/>
+            </w:pPr>
+            <w:r>
+              <w:t xml:space="preserve">0.1.2</w:t>
+            </w:r>
+          </w:p>
+        </w:tc>
+        <w:tc>
+          <w:tcPr/>
+          <w:p>
+            <w:pPr>
+              <w:pStyle w:val="Compact"/>
+              <w:jc w:val="left"/>
+            </w:pPr>
+            <w:r>
+              <w:t xml:space="preserve">(12)</w:t>
             </w:r>
           </w:p>
         </w:tc>
@@ -508,31 +517,31 @@
               <w:jc w:val="left"/>
             </w:pPr>
             <w:r>
-              <w:t xml:space="preserve">janitor</w:t>
-            </w:r>
-          </w:p>
-        </w:tc>
-        <w:tc>
-          <w:tcPr/>
-          <w:p>
-            <w:pPr>
-              <w:pStyle w:val="Compact"/>
-              <w:jc w:val="left"/>
-            </w:pPr>
-            <w:r>
-              <w:t xml:space="preserve">2.2.1</w:t>
-            </w:r>
-          </w:p>
-        </w:tc>
-        <w:tc>
-          <w:tcPr/>
-          <w:p>
-            <w:pPr>
-              <w:pStyle w:val="Compact"/>
-              <w:jc w:val="left"/>
-            </w:pPr>
-            <w:r>
-              <w:t xml:space="preserve">(12)</w:t>
+              <w:t xml:space="preserve">Gifi</w:t>
+            </w:r>
+          </w:p>
+        </w:tc>
+        <w:tc>
+          <w:tcPr/>
+          <w:p>
+            <w:pPr>
+              <w:pStyle w:val="Compact"/>
+              <w:jc w:val="left"/>
+            </w:pPr>
+            <w:r>
+              <w:t xml:space="preserve">1.0.0</w:t>
+            </w:r>
+          </w:p>
+        </w:tc>
+        <w:tc>
+          <w:tcPr/>
+          <w:p>
+            <w:pPr>
+              <w:pStyle w:val="Compact"/>
+              <w:jc w:val="left"/>
+            </w:pPr>
+            <w:r>
+              <w:t xml:space="preserve">(13)</w:t>
             </w:r>
           </w:p>
         </w:tc>
@@ -546,67 +555,31 @@
               <w:jc w:val="left"/>
             </w:pPr>
             <w:r>
-              <w:t xml:space="preserve">mgcv</w:t>
-            </w:r>
-          </w:p>
-        </w:tc>
-        <w:tc>
-          <w:tcPr/>
-          <w:p>
-            <w:pPr>
-              <w:pStyle w:val="Compact"/>
-              <w:jc w:val="left"/>
-            </w:pPr>
-            <w:r>
-              <w:t xml:space="preserve">1.9.1</w:t>
-            </w:r>
-          </w:p>
-        </w:tc>
-        <w:tc>
-          <w:tcPr/>
-          <w:p>
-            <w:pPr>
-              <w:pStyle w:val="Compact"/>
-              <w:jc w:val="left"/>
-            </w:pPr>
-            <w:r>
-              <w:t xml:space="preserve">(13)</w:t>
-            </w:r>
-            <w:r>
-              <w:t xml:space="preserve">;</w:t>
-            </w:r>
-            <w:r>
-              <w:t xml:space="preserve"> </w:t>
-            </w:r>
+              <w:t xml:space="preserve">gtsummary</w:t>
+            </w:r>
+          </w:p>
+        </w:tc>
+        <w:tc>
+          <w:tcPr/>
+          <w:p>
+            <w:pPr>
+              <w:pStyle w:val="Compact"/>
+              <w:jc w:val="left"/>
+            </w:pPr>
+            <w:r>
+              <w:t xml:space="preserve">2.3.0</w:t>
+            </w:r>
+          </w:p>
+        </w:tc>
+        <w:tc>
+          <w:tcPr/>
+          <w:p>
+            <w:pPr>
+              <w:pStyle w:val="Compact"/>
+              <w:jc w:val="left"/>
+            </w:pPr>
             <w:r>
               <w:t xml:space="preserve">(14)</w:t>
-            </w:r>
-            <w:r>
-              <w:t xml:space="preserve">;</w:t>
-            </w:r>
-            <w:r>
-              <w:t xml:space="preserve"> </w:t>
-            </w:r>
-            <w:r>
-              <w:t xml:space="preserve">(15)</w:t>
-            </w:r>
-            <w:r>
-              <w:t xml:space="preserve">;</w:t>
-            </w:r>
-            <w:r>
-              <w:t xml:space="preserve"> </w:t>
-            </w:r>
-            <w:r>
-              <w:t xml:space="preserve">(16)</w:t>
-            </w:r>
-            <w:r>
-              <w:t xml:space="preserve">;</w:t>
-            </w:r>
-            <w:r>
-              <w:t xml:space="preserve"> </w:t>
-            </w:r>
-            <w:r>
-              <w:t xml:space="preserve">(17)</w:t>
             </w:r>
           </w:p>
         </w:tc>
@@ -620,31 +593,31 @@
               <w:jc w:val="left"/>
             </w:pPr>
             <w:r>
-              <w:t xml:space="preserve">officer</w:t>
-            </w:r>
-          </w:p>
-        </w:tc>
-        <w:tc>
-          <w:tcPr/>
-          <w:p>
-            <w:pPr>
-              <w:pStyle w:val="Compact"/>
-              <w:jc w:val="left"/>
-            </w:pPr>
-            <w:r>
-              <w:t xml:space="preserve">0.6.10</w:t>
-            </w:r>
-          </w:p>
-        </w:tc>
-        <w:tc>
-          <w:tcPr/>
-          <w:p>
-            <w:pPr>
-              <w:pStyle w:val="Compact"/>
-              <w:jc w:val="left"/>
-            </w:pPr>
-            <w:r>
-              <w:t xml:space="preserve">(18)</w:t>
+              <w:t xml:space="preserve">here</w:t>
+            </w:r>
+          </w:p>
+        </w:tc>
+        <w:tc>
+          <w:tcPr/>
+          <w:p>
+            <w:pPr>
+              <w:pStyle w:val="Compact"/>
+              <w:jc w:val="left"/>
+            </w:pPr>
+            <w:r>
+              <w:t xml:space="preserve">1.0.1</w:t>
+            </w:r>
+          </w:p>
+        </w:tc>
+        <w:tc>
+          <w:tcPr/>
+          <w:p>
+            <w:pPr>
+              <w:pStyle w:val="Compact"/>
+              <w:jc w:val="left"/>
+            </w:pPr>
+            <w:r>
+              <w:t xml:space="preserve">(15)</w:t>
             </w:r>
           </w:p>
         </w:tc>
@@ -658,31 +631,31 @@
               <w:jc w:val="left"/>
             </w:pPr>
             <w:r>
-              <w:t xml:space="preserve">pacman</w:t>
-            </w:r>
-          </w:p>
-        </w:tc>
-        <w:tc>
-          <w:tcPr/>
-          <w:p>
-            <w:pPr>
-              <w:pStyle w:val="Compact"/>
-              <w:jc w:val="left"/>
-            </w:pPr>
-            <w:r>
-              <w:t xml:space="preserve">0.5.1</w:t>
-            </w:r>
-          </w:p>
-        </w:tc>
-        <w:tc>
-          <w:tcPr/>
-          <w:p>
-            <w:pPr>
-              <w:pStyle w:val="Compact"/>
-              <w:jc w:val="left"/>
-            </w:pPr>
-            <w:r>
-              <w:t xml:space="preserve">(19)</w:t>
+              <w:t xml:space="preserve">Hmisc</w:t>
+            </w:r>
+          </w:p>
+        </w:tc>
+        <w:tc>
+          <w:tcPr/>
+          <w:p>
+            <w:pPr>
+              <w:pStyle w:val="Compact"/>
+              <w:jc w:val="left"/>
+            </w:pPr>
+            <w:r>
+              <w:t xml:space="preserve">5.2.4</w:t>
+            </w:r>
+          </w:p>
+        </w:tc>
+        <w:tc>
+          <w:tcPr/>
+          <w:p>
+            <w:pPr>
+              <w:pStyle w:val="Compact"/>
+              <w:jc w:val="left"/>
+            </w:pPr>
+            <w:r>
+              <w:t xml:space="preserve">(16)</w:t>
             </w:r>
           </w:p>
         </w:tc>
@@ -696,31 +669,31 @@
               <w:jc w:val="left"/>
             </w:pPr>
             <w:r>
-              <w:t xml:space="preserve">performance</w:t>
-            </w:r>
-          </w:p>
-        </w:tc>
-        <w:tc>
-          <w:tcPr/>
-          <w:p>
-            <w:pPr>
-              <w:pStyle w:val="Compact"/>
-              <w:jc w:val="left"/>
-            </w:pPr>
-            <w:r>
-              <w:t xml:space="preserve">0.15.0</w:t>
-            </w:r>
-          </w:p>
-        </w:tc>
-        <w:tc>
-          <w:tcPr/>
-          <w:p>
-            <w:pPr>
-              <w:pStyle w:val="Compact"/>
-              <w:jc w:val="left"/>
-            </w:pPr>
-            <w:r>
-              <w:t xml:space="preserve">(20)</w:t>
+              <w:t xml:space="preserve">janitor</w:t>
+            </w:r>
+          </w:p>
+        </w:tc>
+        <w:tc>
+          <w:tcPr/>
+          <w:p>
+            <w:pPr>
+              <w:pStyle w:val="Compact"/>
+              <w:jc w:val="left"/>
+            </w:pPr>
+            <w:r>
+              <w:t xml:space="preserve">2.2.1</w:t>
+            </w:r>
+          </w:p>
+        </w:tc>
+        <w:tc>
+          <w:tcPr/>
+          <w:p>
+            <w:pPr>
+              <w:pStyle w:val="Compact"/>
+              <w:jc w:val="left"/>
+            </w:pPr>
+            <w:r>
+              <w:t xml:space="preserve">(17)</w:t>
             </w:r>
           </w:p>
         </w:tc>
@@ -734,31 +707,67 @@
               <w:jc w:val="left"/>
             </w:pPr>
             <w:r>
-              <w:t xml:space="preserve">psych</w:t>
-            </w:r>
-          </w:p>
-        </w:tc>
-        <w:tc>
-          <w:tcPr/>
-          <w:p>
-            <w:pPr>
-              <w:pStyle w:val="Compact"/>
-              <w:jc w:val="left"/>
-            </w:pPr>
-            <w:r>
-              <w:t xml:space="preserve">2.5.6</w:t>
-            </w:r>
-          </w:p>
-        </w:tc>
-        <w:tc>
-          <w:tcPr/>
-          <w:p>
-            <w:pPr>
-              <w:pStyle w:val="Compact"/>
-              <w:jc w:val="left"/>
-            </w:pPr>
+              <w:t xml:space="preserve">mgcv</w:t>
+            </w:r>
+          </w:p>
+        </w:tc>
+        <w:tc>
+          <w:tcPr/>
+          <w:p>
+            <w:pPr>
+              <w:pStyle w:val="Compact"/>
+              <w:jc w:val="left"/>
+            </w:pPr>
+            <w:r>
+              <w:t xml:space="preserve">1.9.1</w:t>
+            </w:r>
+          </w:p>
+        </w:tc>
+        <w:tc>
+          <w:tcPr/>
+          <w:p>
+            <w:pPr>
+              <w:pStyle w:val="Compact"/>
+              <w:jc w:val="left"/>
+            </w:pPr>
+            <w:r>
+              <w:t xml:space="preserve">(18)</w:t>
+            </w:r>
+            <w:r>
+              <w:t xml:space="preserve">;</w:t>
+            </w:r>
+            <w:r>
+              <w:t xml:space="preserve"> </w:t>
+            </w:r>
+            <w:r>
+              <w:t xml:space="preserve">(19)</w:t>
+            </w:r>
+            <w:r>
+              <w:t xml:space="preserve">;</w:t>
+            </w:r>
+            <w:r>
+              <w:t xml:space="preserve"> </w:t>
+            </w:r>
+            <w:r>
+              <w:t xml:space="preserve">(20)</w:t>
+            </w:r>
+            <w:r>
+              <w:t xml:space="preserve">;</w:t>
+            </w:r>
+            <w:r>
+              <w:t xml:space="preserve"> </w:t>
+            </w:r>
             <w:r>
               <w:t xml:space="preserve">(21)</w:t>
+            </w:r>
+            <w:r>
+              <w:t xml:space="preserve">;</w:t>
+            </w:r>
+            <w:r>
+              <w:t xml:space="preserve"> </w:t>
+            </w:r>
+            <w:r>
+              <w:t xml:space="preserve">(22)</w:t>
             </w:r>
           </w:p>
         </w:tc>
@@ -772,31 +781,31 @@
               <w:jc w:val="left"/>
             </w:pPr>
             <w:r>
-              <w:t xml:space="preserve">rfextras</w:t>
-            </w:r>
-          </w:p>
-        </w:tc>
-        <w:tc>
-          <w:tcPr/>
-          <w:p>
-            <w:pPr>
-              <w:pStyle w:val="Compact"/>
-              <w:jc w:val="left"/>
-            </w:pPr>
-            <w:r>
-              <w:t xml:space="preserve">0.0.1</w:t>
-            </w:r>
-          </w:p>
-        </w:tc>
-        <w:tc>
-          <w:tcPr/>
-          <w:p>
-            <w:pPr>
-              <w:pStyle w:val="Compact"/>
-              <w:jc w:val="left"/>
-            </w:pPr>
-            <w:r>
-              <w:t xml:space="preserve">(22)</w:t>
+              <w:t xml:space="preserve">officer</w:t>
+            </w:r>
+          </w:p>
+        </w:tc>
+        <w:tc>
+          <w:tcPr/>
+          <w:p>
+            <w:pPr>
+              <w:pStyle w:val="Compact"/>
+              <w:jc w:val="left"/>
+            </w:pPr>
+            <w:r>
+              <w:t xml:space="preserve">0.6.10</w:t>
+            </w:r>
+          </w:p>
+        </w:tc>
+        <w:tc>
+          <w:tcPr/>
+          <w:p>
+            <w:pPr>
+              <w:pStyle w:val="Compact"/>
+              <w:jc w:val="left"/>
+            </w:pPr>
+            <w:r>
+              <w:t xml:space="preserve">(23)</w:t>
             </w:r>
           </w:p>
         </w:tc>
@@ -810,31 +819,31 @@
               <w:jc w:val="left"/>
             </w:pPr>
             <w:r>
-              <w:t xml:space="preserve">rio</w:t>
-            </w:r>
-          </w:p>
-        </w:tc>
-        <w:tc>
-          <w:tcPr/>
-          <w:p>
-            <w:pPr>
-              <w:pStyle w:val="Compact"/>
-              <w:jc w:val="left"/>
-            </w:pPr>
-            <w:r>
-              <w:t xml:space="preserve">1.2.3</w:t>
-            </w:r>
-          </w:p>
-        </w:tc>
-        <w:tc>
-          <w:tcPr/>
-          <w:p>
-            <w:pPr>
-              <w:pStyle w:val="Compact"/>
-              <w:jc w:val="left"/>
-            </w:pPr>
-            <w:r>
-              <w:t xml:space="preserve">(23)</w:t>
+              <w:t xml:space="preserve">pacman</w:t>
+            </w:r>
+          </w:p>
+        </w:tc>
+        <w:tc>
+          <w:tcPr/>
+          <w:p>
+            <w:pPr>
+              <w:pStyle w:val="Compact"/>
+              <w:jc w:val="left"/>
+            </w:pPr>
+            <w:r>
+              <w:t xml:space="preserve">0.5.1</w:t>
+            </w:r>
+          </w:p>
+        </w:tc>
+        <w:tc>
+          <w:tcPr/>
+          <w:p>
+            <w:pPr>
+              <w:pStyle w:val="Compact"/>
+              <w:jc w:val="left"/>
+            </w:pPr>
+            <w:r>
+              <w:t xml:space="preserve">(24)</w:t>
             </w:r>
           </w:p>
         </w:tc>
@@ -848,49 +857,31 @@
               <w:jc w:val="left"/>
             </w:pPr>
             <w:r>
-              <w:t xml:space="preserve">rmarkdown</w:t>
-            </w:r>
-          </w:p>
-        </w:tc>
-        <w:tc>
-          <w:tcPr/>
-          <w:p>
-            <w:pPr>
-              <w:pStyle w:val="Compact"/>
-              <w:jc w:val="left"/>
-            </w:pPr>
-            <w:r>
-              <w:t xml:space="preserve">2.29</w:t>
-            </w:r>
-          </w:p>
-        </w:tc>
-        <w:tc>
-          <w:tcPr/>
-          <w:p>
-            <w:pPr>
-              <w:pStyle w:val="Compact"/>
-              <w:jc w:val="left"/>
-            </w:pPr>
-            <w:r>
-              <w:t xml:space="preserve">(24)</w:t>
-            </w:r>
-            <w:r>
-              <w:t xml:space="preserve">;</w:t>
-            </w:r>
-            <w:r>
-              <w:t xml:space="preserve"> </w:t>
-            </w:r>
+              <w:t xml:space="preserve">performance</w:t>
+            </w:r>
+          </w:p>
+        </w:tc>
+        <w:tc>
+          <w:tcPr/>
+          <w:p>
+            <w:pPr>
+              <w:pStyle w:val="Compact"/>
+              <w:jc w:val="left"/>
+            </w:pPr>
+            <w:r>
+              <w:t xml:space="preserve">0.15.0</w:t>
+            </w:r>
+          </w:p>
+        </w:tc>
+        <w:tc>
+          <w:tcPr/>
+          <w:p>
+            <w:pPr>
+              <w:pStyle w:val="Compact"/>
+              <w:jc w:val="left"/>
+            </w:pPr>
             <w:r>
               <w:t xml:space="preserve">(25)</w:t>
-            </w:r>
-            <w:r>
-              <w:t xml:space="preserve">;</w:t>
-            </w:r>
-            <w:r>
-              <w:t xml:space="preserve"> </w:t>
-            </w:r>
-            <w:r>
-              <w:t xml:space="preserve">(26)</w:t>
             </w:r>
           </w:p>
         </w:tc>
@@ -904,31 +895,31 @@
               <w:jc w:val="left"/>
             </w:pPr>
             <w:r>
-              <w:t xml:space="preserve">rms</w:t>
-            </w:r>
-          </w:p>
-        </w:tc>
-        <w:tc>
-          <w:tcPr/>
-          <w:p>
-            <w:pPr>
-              <w:pStyle w:val="Compact"/>
-              <w:jc w:val="left"/>
-            </w:pPr>
-            <w:r>
-              <w:t xml:space="preserve">8.1.0</w:t>
-            </w:r>
-          </w:p>
-        </w:tc>
-        <w:tc>
-          <w:tcPr/>
-          <w:p>
-            <w:pPr>
-              <w:pStyle w:val="Compact"/>
-              <w:jc w:val="left"/>
-            </w:pPr>
-            <w:r>
-              <w:t xml:space="preserve">(27)</w:t>
+              <w:t xml:space="preserve">psych</w:t>
+            </w:r>
+          </w:p>
+        </w:tc>
+        <w:tc>
+          <w:tcPr/>
+          <w:p>
+            <w:pPr>
+              <w:pStyle w:val="Compact"/>
+              <w:jc w:val="left"/>
+            </w:pPr>
+            <w:r>
+              <w:t xml:space="preserve">2.5.6</w:t>
+            </w:r>
+          </w:p>
+        </w:tc>
+        <w:tc>
+          <w:tcPr/>
+          <w:p>
+            <w:pPr>
+              <w:pStyle w:val="Compact"/>
+              <w:jc w:val="left"/>
+            </w:pPr>
+            <w:r>
+              <w:t xml:space="preserve">(26)</w:t>
             </w:r>
           </w:p>
         </w:tc>
@@ -942,6 +933,176 @@
               <w:jc w:val="left"/>
             </w:pPr>
             <w:r>
+              <w:t xml:space="preserve">rcompanion</w:t>
+            </w:r>
+          </w:p>
+        </w:tc>
+        <w:tc>
+          <w:tcPr/>
+          <w:p>
+            <w:pPr>
+              <w:pStyle w:val="Compact"/>
+              <w:jc w:val="left"/>
+            </w:pPr>
+            <w:r>
+              <w:t xml:space="preserve">2.5.2</w:t>
+            </w:r>
+          </w:p>
+        </w:tc>
+        <w:tc>
+          <w:tcPr/>
+          <w:p>
+            <w:pPr>
+              <w:pStyle w:val="Compact"/>
+              <w:jc w:val="left"/>
+            </w:pPr>
+            <w:r>
+              <w:t xml:space="preserve">(27)</w:t>
+            </w:r>
+          </w:p>
+        </w:tc>
+      </w:tr>
+      <w:tr>
+        <w:tc>
+          <w:tcPr/>
+          <w:p>
+            <w:pPr>
+              <w:pStyle w:val="Compact"/>
+              <w:jc w:val="left"/>
+            </w:pPr>
+            <w:r>
+              <w:t xml:space="preserve">rio</w:t>
+            </w:r>
+          </w:p>
+        </w:tc>
+        <w:tc>
+          <w:tcPr/>
+          <w:p>
+            <w:pPr>
+              <w:pStyle w:val="Compact"/>
+              <w:jc w:val="left"/>
+            </w:pPr>
+            <w:r>
+              <w:t xml:space="preserve">1.2.3</w:t>
+            </w:r>
+          </w:p>
+        </w:tc>
+        <w:tc>
+          <w:tcPr/>
+          <w:p>
+            <w:pPr>
+              <w:pStyle w:val="Compact"/>
+              <w:jc w:val="left"/>
+            </w:pPr>
+            <w:r>
+              <w:t xml:space="preserve">(28)</w:t>
+            </w:r>
+          </w:p>
+        </w:tc>
+      </w:tr>
+      <w:tr>
+        <w:tc>
+          <w:tcPr/>
+          <w:p>
+            <w:pPr>
+              <w:pStyle w:val="Compact"/>
+              <w:jc w:val="left"/>
+            </w:pPr>
+            <w:r>
+              <w:t xml:space="preserve">rmarkdown</w:t>
+            </w:r>
+          </w:p>
+        </w:tc>
+        <w:tc>
+          <w:tcPr/>
+          <w:p>
+            <w:pPr>
+              <w:pStyle w:val="Compact"/>
+              <w:jc w:val="left"/>
+            </w:pPr>
+            <w:r>
+              <w:t xml:space="preserve">2.29</w:t>
+            </w:r>
+          </w:p>
+        </w:tc>
+        <w:tc>
+          <w:tcPr/>
+          <w:p>
+            <w:pPr>
+              <w:pStyle w:val="Compact"/>
+              <w:jc w:val="left"/>
+            </w:pPr>
+            <w:r>
+              <w:t xml:space="preserve">(29)</w:t>
+            </w:r>
+            <w:r>
+              <w:t xml:space="preserve">;</w:t>
+            </w:r>
+            <w:r>
+              <w:t xml:space="preserve"> </w:t>
+            </w:r>
+            <w:r>
+              <w:t xml:space="preserve">(30)</w:t>
+            </w:r>
+            <w:r>
+              <w:t xml:space="preserve">;</w:t>
+            </w:r>
+            <w:r>
+              <w:t xml:space="preserve"> </w:t>
+            </w:r>
+            <w:r>
+              <w:t xml:space="preserve">(31)</w:t>
+            </w:r>
+          </w:p>
+        </w:tc>
+      </w:tr>
+      <w:tr>
+        <w:tc>
+          <w:tcPr/>
+          <w:p>
+            <w:pPr>
+              <w:pStyle w:val="Compact"/>
+              <w:jc w:val="left"/>
+            </w:pPr>
+            <w:r>
+              <w:t xml:space="preserve">rms</w:t>
+            </w:r>
+          </w:p>
+        </w:tc>
+        <w:tc>
+          <w:tcPr/>
+          <w:p>
+            <w:pPr>
+              <w:pStyle w:val="Compact"/>
+              <w:jc w:val="left"/>
+            </w:pPr>
+            <w:r>
+              <w:t xml:space="preserve">8.1.0</w:t>
+            </w:r>
+          </w:p>
+        </w:tc>
+        <w:tc>
+          <w:tcPr/>
+          <w:p>
+            <w:pPr>
+              <w:pStyle w:val="Compact"/>
+              <w:jc w:val="left"/>
+            </w:pPr>
+            <w:r>
+              <w:t xml:space="preserve">(32)</w:t>
+            </w:r>
+          </w:p>
+        </w:tc>
+      </w:tr>
+      <w:tr>
+        <w:tc>
+          <w:tcPr/>
+          <w:p>
+            <w:pPr>
+              <w:pStyle w:val="Compact"/>
+              <w:jc w:val="left"/>
+            </w:pPr>
+            <w:r>
               <w:t xml:space="preserve">tidyverse</w:t>
             </w:r>
           </w:p>
@@ -966,7 +1127,7 @@
               <w:jc w:val="left"/>
             </w:pPr>
             <w:r>
-              <w:t xml:space="preserve">(28)</w:t>
+              <w:t xml:space="preserve">(33)</w:t>
             </w:r>
           </w:p>
         </w:tc>
@@ -1001,13 +1162,22 @@
         <w:t xml:space="preserve"> </w:t>
       </w:r>
       <w:r>
-        <w:t xml:space="preserve">and the following R packages: epiDisplay v. 3.5.0.2</w:t>
-      </w:r>
-      <w:r>
-        <w:t xml:space="preserve"> </w:t>
-      </w:r>
-      <w:r>
-        <w:t xml:space="preserve">(2)</w:t>
+        <w:t xml:space="preserve">and the following R packages: coin v. 1.4.3</w:t>
+      </w:r>
+      <w:r>
+        <w:t xml:space="preserve"> </w:t>
+      </w:r>
+      <w:r>
+        <w:t xml:space="preserve">(2,3)</w:t>
+      </w:r>
+      <w:r>
+        <w:t xml:space="preserve">, eulerr v. 7.1.0</w:t>
+      </w:r>
+      <w:r>
+        <w:t xml:space="preserve"> </w:t>
+      </w:r>
+      <w:r>
+        <w:t xml:space="preserve">(4)</w:t>
       </w:r>
       <w:r>
         <w:t xml:space="preserve">, factoextra v. 1.0.7</w:t>
@@ -1016,7 +1186,7 @@
         <w:t xml:space="preserve"> </w:t>
       </w:r>
       <w:r>
-        <w:t xml:space="preserve">(3)</w:t>
+        <w:t xml:space="preserve">(5)</w:t>
       </w:r>
       <w:r>
         <w:t xml:space="preserve">, finalfit v. 1.0.8</w:t>
@@ -1025,7 +1195,7 @@
         <w:t xml:space="preserve"> </w:t>
       </w:r>
       <w:r>
-        <w:t xml:space="preserve">(4)</w:t>
+        <w:t xml:space="preserve">(6)</w:t>
       </w:r>
       <w:r>
         <w:t xml:space="preserve">, flextable v. 0.9.9</w:t>
@@ -1034,7 +1204,16 @@
         <w:t xml:space="preserve"> </w:t>
       </w:r>
       <w:r>
-        <w:t xml:space="preserve">(5)</w:t>
+        <w:t xml:space="preserve">(7)</w:t>
+      </w:r>
+      <w:r>
+        <w:t xml:space="preserve">, FSA v. 0.10.1</w:t>
+      </w:r>
+      <w:r>
+        <w:t xml:space="preserve"> </w:t>
+      </w:r>
+      <w:r>
+        <w:t xml:space="preserve">(8)</w:t>
       </w:r>
       <w:r>
         <w:t xml:space="preserve">, ggeffects v. 2.3.1</w:t>
@@ -1043,7 +1222,7 @@
         <w:t xml:space="preserve"> </w:t>
       </w:r>
       <w:r>
-        <w:t xml:space="preserve">(6)</w:t>
+        <w:t xml:space="preserve">(9)</w:t>
       </w:r>
       <w:r>
         <w:t xml:space="preserve">, ggpubr v. 0.6.1</w:t>
@@ -1052,7 +1231,16 @@
         <w:t xml:space="preserve"> </w:t>
       </w:r>
       <w:r>
-        <w:t xml:space="preserve">(7)</w:t>
+        <w:t xml:space="preserve">(10)</w:t>
+      </w:r>
+      <w:r>
+        <w:t xml:space="preserve">, ggsci v. 3.2.0</w:t>
+      </w:r>
+      <w:r>
+        <w:t xml:space="preserve"> </w:t>
+      </w:r>
+      <w:r>
+        <w:t xml:space="preserve">(11)</w:t>
       </w:r>
       <w:r>
         <w:t xml:space="preserve">, ggtext v. 0.1.2</w:t>
@@ -1061,7 +1249,16 @@
         <w:t xml:space="preserve"> </w:t>
       </w:r>
       <w:r>
-        <w:t xml:space="preserve">(8)</w:t>
+        <w:t xml:space="preserve">(12)</w:t>
+      </w:r>
+      <w:r>
+        <w:t xml:space="preserve">, Gifi v. 1.0.0</w:t>
+      </w:r>
+      <w:r>
+        <w:t xml:space="preserve"> </w:t>
+      </w:r>
+      <w:r>
+        <w:t xml:space="preserve">(13)</w:t>
       </w:r>
       <w:r>
         <w:t xml:space="preserve">, gtsummary v. 2.3.0</w:t>
@@ -1070,7 +1267,7 @@
         <w:t xml:space="preserve"> </w:t>
       </w:r>
       <w:r>
-        <w:t xml:space="preserve">(9)</w:t>
+        <w:t xml:space="preserve">(14)</w:t>
       </w:r>
       <w:r>
         <w:t xml:space="preserve">, here v. 1.0.1</w:t>
@@ -1079,7 +1276,7 @@
         <w:t xml:space="preserve"> </w:t>
       </w:r>
       <w:r>
-        <w:t xml:space="preserve">(10)</w:t>
+        <w:t xml:space="preserve">(15)</w:t>
       </w:r>
       <w:r>
         <w:t xml:space="preserve">, Hmisc v. 5.2.4</w:t>
@@ -1088,7 +1285,7 @@
         <w:t xml:space="preserve"> </w:t>
       </w:r>
       <w:r>
-        <w:t xml:space="preserve">(11)</w:t>
+        <w:t xml:space="preserve">(16)</w:t>
       </w:r>
       <w:r>
         <w:t xml:space="preserve">, janitor v. 2.2.1</w:t>
@@ -1097,7 +1294,7 @@
         <w:t xml:space="preserve"> </w:t>
       </w:r>
       <w:r>
-        <w:t xml:space="preserve">(12)</w:t>
+        <w:t xml:space="preserve">(17)</w:t>
       </w:r>
       <w:r>
         <w:t xml:space="preserve">, mgcv v. 1.9.1</w:t>
@@ -1106,7 +1303,7 @@
         <w:t xml:space="preserve"> </w:t>
       </w:r>
       <w:r>
-        <w:t xml:space="preserve">(13–17)</w:t>
+        <w:t xml:space="preserve">(18–22)</w:t>
       </w:r>
       <w:r>
         <w:t xml:space="preserve">, officer v. 0.6.10</w:t>
@@ -1115,7 +1312,7 @@
         <w:t xml:space="preserve"> </w:t>
       </w:r>
       <w:r>
-        <w:t xml:space="preserve">(18)</w:t>
+        <w:t xml:space="preserve">(23)</w:t>
       </w:r>
       <w:r>
         <w:t xml:space="preserve">, pacman v. 0.5.1</w:t>
@@ -1124,7 +1321,7 @@
         <w:t xml:space="preserve"> </w:t>
       </w:r>
       <w:r>
-        <w:t xml:space="preserve">(19)</w:t>
+        <w:t xml:space="preserve">(24)</w:t>
       </w:r>
       <w:r>
         <w:t xml:space="preserve">, performance v. 0.15.0</w:t>
@@ -1133,7 +1330,7 @@
         <w:t xml:space="preserve"> </w:t>
       </w:r>
       <w:r>
-        <w:t xml:space="preserve">(20)</w:t>
+        <w:t xml:space="preserve">(25)</w:t>
       </w:r>
       <w:r>
         <w:t xml:space="preserve">, psych v. 2.5.6</w:t>
@@ -1142,16 +1339,16 @@
         <w:t xml:space="preserve"> </w:t>
       </w:r>
       <w:r>
-        <w:t xml:space="preserve">(21)</w:t>
-      </w:r>
-      <w:r>
-        <w:t xml:space="preserve">, rfextras v. 0.0.1</w:t>
-      </w:r>
-      <w:r>
-        <w:t xml:space="preserve"> </w:t>
-      </w:r>
-      <w:r>
-        <w:t xml:space="preserve">(22)</w:t>
+        <w:t xml:space="preserve">(26)</w:t>
+      </w:r>
+      <w:r>
+        <w:t xml:space="preserve">, rcompanion v. 2.5.2</w:t>
+      </w:r>
+      <w:r>
+        <w:t xml:space="preserve"> </w:t>
+      </w:r>
+      <w:r>
+        <w:t xml:space="preserve">(27)</w:t>
       </w:r>
       <w:r>
         <w:t xml:space="preserve">, rio v. 1.2.3</w:t>
@@ -1160,7 +1357,7 @@
         <w:t xml:space="preserve"> </w:t>
       </w:r>
       <w:r>
-        <w:t xml:space="preserve">(23)</w:t>
+        <w:t xml:space="preserve">(28)</w:t>
       </w:r>
       <w:r>
         <w:t xml:space="preserve">, rmarkdown v. 2.29</w:t>
@@ -1169,7 +1366,7 @@
         <w:t xml:space="preserve"> </w:t>
       </w:r>
       <w:r>
-        <w:t xml:space="preserve">(24–26)</w:t>
+        <w:t xml:space="preserve">(29–31)</w:t>
       </w:r>
       <w:r>
         <w:t xml:space="preserve">, rms v. 8.1.0</w:t>
@@ -1178,7 +1375,7 @@
         <w:t xml:space="preserve"> </w:t>
       </w:r>
       <w:r>
-        <w:t xml:space="preserve">(27)</w:t>
+        <w:t xml:space="preserve">(32)</w:t>
       </w:r>
       <w:r>
         <w:t xml:space="preserve">, tidyverse v. 2.0.0</w:t>
@@ -1187,14 +1384,14 @@
         <w:t xml:space="preserve"> </w:t>
       </w:r>
       <w:r>
-        <w:t xml:space="preserve">(28)</w:t>
+        <w:t xml:space="preserve">(33)</w:t>
       </w:r>
       <w:r>
         <w:t xml:space="preserve">.</w:t>
       </w:r>
     </w:p>
     <w:bookmarkEnd w:id="20"/>
-    <w:bookmarkStart w:id="73" w:name="package-citations"/>
+    <w:bookmarkStart w:id="83" w:name="package-citations"/>
     <w:p>
       <w:pPr>
         <w:pStyle w:val="Heading2"/>
@@ -1203,7 +1400,7 @@
         <w:t xml:space="preserve">Package citations</w:t>
       </w:r>
     </w:p>
-    <w:bookmarkStart w:id="72" w:name="refs"/>
+    <w:bookmarkStart w:id="82" w:name="refs"/>
     <w:bookmarkStart w:id="22" w:name="ref-base"/>
     <w:p>
       <w:pPr>
@@ -1243,7 +1440,7 @@
       </w:hyperlink>
     </w:p>
     <w:bookmarkEnd w:id="22"/>
-    <w:bookmarkStart w:id="24" w:name="ref-epiDisplay"/>
+    <w:bookmarkStart w:id="24" w:name="ref-coin2006"/>
     <w:p>
       <w:pPr>
         <w:pStyle w:val="Bibliography"/>
@@ -1258,16 +1455,7 @@
         <w:t xml:space="preserve">	</w:t>
       </w:r>
       <w:r>
-        <w:t xml:space="preserve">Chongsuvivatwong V.</w:t>
-      </w:r>
-      <w:r>
-        <w:t xml:space="preserve"> </w:t>
-      </w:r>
-      <w:r>
-        <w:t xml:space="preserve">epiDisplay</w:t>
-      </w:r>
-      <w:r>
-        <w:t xml:space="preserve">: Epidemiological data display package [Internet]. 2022. Available from:</w:t>
+        <w:t xml:space="preserve">Hothorn T, Hornik K, van de Wiel MA, Zeileis A.</w:t>
       </w:r>
       <w:r>
         <w:t xml:space="preserve"> </w:t>
@@ -1277,12 +1465,36 @@
           <w:rPr>
             <w:rStyle w:val="Hyperlink"/>
           </w:rPr>
-          <w:t xml:space="preserve">https://CRAN.R-project.org/package=epiDisplay</w:t>
+          <w:t xml:space="preserve">A</w:t>
+        </w:r>
+        <w:r>
+          <w:rPr>
+            <w:rStyle w:val="Hyperlink"/>
+          </w:rPr>
+          <w:t xml:space="preserve"> </w:t>
+        </w:r>
+        <w:r>
+          <w:rPr>
+            <w:rStyle w:val="Hyperlink"/>
+          </w:rPr>
+          <w:t xml:space="preserve">L</w:t>
+        </w:r>
+        <w:r>
+          <w:rPr>
+            <w:rStyle w:val="Hyperlink"/>
+          </w:rPr>
+          <w:t xml:space="preserve">ego system for conditional inference</w:t>
         </w:r>
       </w:hyperlink>
+      <w:r>
+        <w:t xml:space="preserve">. The American Statistician. 2006;60(3):257–63.</w:t>
+      </w:r>
+      <w:r>
+        <w:t xml:space="preserve"> </w:t>
+      </w:r>
     </w:p>
     <w:bookmarkEnd w:id="24"/>
-    <w:bookmarkStart w:id="26" w:name="ref-factoextra"/>
+    <w:bookmarkStart w:id="26" w:name="ref-coin2008"/>
     <w:p>
       <w:pPr>
         <w:pStyle w:val="Bibliography"/>
@@ -1297,16 +1509,7 @@
         <w:t xml:space="preserve">	</w:t>
       </w:r>
       <w:r>
-        <w:t xml:space="preserve">Kassambara A, Mundt F.</w:t>
-      </w:r>
-      <w:r>
-        <w:t xml:space="preserve"> </w:t>
-      </w:r>
-      <w:r>
-        <w:t xml:space="preserve">factoextra</w:t>
-      </w:r>
-      <w:r>
-        <w:t xml:space="preserve">: Extract and visualize the results of multivariate data analyses [Internet]. 2020. Available from:</w:t>
+        <w:t xml:space="preserve">Hothorn T, Hornik K, van de Wiel MA, Zeileis A.</w:t>
       </w:r>
       <w:r>
         <w:t xml:space="preserve"> </w:t>
@@ -1316,12 +1519,42 @@
           <w:rPr>
             <w:rStyle w:val="Hyperlink"/>
           </w:rPr>
-          <w:t xml:space="preserve">https://CRAN.R-project.org/package=factoextra</w:t>
+          <w:t xml:space="preserve">Implementing a class of permutation tests: The</w:t>
+        </w:r>
+        <w:r>
+          <w:rPr>
+            <w:rStyle w:val="Hyperlink"/>
+          </w:rPr>
+          <w:t xml:space="preserve"> </w:t>
+        </w:r>
+        <w:r>
+          <w:rPr>
+            <w:rStyle w:val="Hyperlink"/>
+          </w:rPr>
+          <w:t xml:space="preserve">coin</w:t>
+        </w:r>
+        <w:r>
+          <w:rPr>
+            <w:rStyle w:val="Hyperlink"/>
+          </w:rPr>
+          <w:t xml:space="preserve"> </w:t>
+        </w:r>
+        <w:r>
+          <w:rPr>
+            <w:rStyle w:val="Hyperlink"/>
+          </w:rPr>
+          <w:t xml:space="preserve">package</w:t>
         </w:r>
       </w:hyperlink>
+      <w:r>
+        <w:t xml:space="preserve">. Journal of Statistical Software. 2008;28(8):1–23.</w:t>
+      </w:r>
+      <w:r>
+        <w:t xml:space="preserve"> </w:t>
+      </w:r>
     </w:p>
     <w:bookmarkEnd w:id="26"/>
-    <w:bookmarkStart w:id="28" w:name="ref-finalfit"/>
+    <w:bookmarkStart w:id="28" w:name="ref-eulerr"/>
     <w:p>
       <w:pPr>
         <w:pStyle w:val="Bibliography"/>
@@ -1336,16 +1569,79 @@
         <w:t xml:space="preserve">	</w:t>
       </w:r>
       <w:r>
-        <w:t xml:space="preserve">Harrison E, Drake T, Pius R.</w:t>
-      </w:r>
-      <w:r>
-        <w:t xml:space="preserve"> </w:t>
-      </w:r>
-      <w:r>
-        <w:t xml:space="preserve">finalfit</w:t>
-      </w:r>
-      <w:r>
-        <w:t xml:space="preserve">: Quickly create elegant regression results tables and plots when modelling [Internet]. 2024. Available from:</w:t>
+        <w:t xml:space="preserve">Larsson J, Gustafsson P. A case study in fitting area-proportional</w:t>
+      </w:r>
+      <w:r>
+        <w:t xml:space="preserve"> </w:t>
+      </w:r>
+      <w:r>
+        <w:t xml:space="preserve">Euler</w:t>
+      </w:r>
+      <w:r>
+        <w:t xml:space="preserve"> </w:t>
+      </w:r>
+      <w:r>
+        <w:t xml:space="preserve">diagrams with ellipses using eulerr. In:</w:t>
+      </w:r>
+      <w:r>
+        <w:t xml:space="preserve"> </w:t>
+      </w:r>
+      <w:r>
+        <w:t xml:space="preserve">Proceedings of</w:t>
+      </w:r>
+      <w:r>
+        <w:t xml:space="preserve"> </w:t>
+      </w:r>
+      <w:r>
+        <w:t xml:space="preserve">International Workshop</w:t>
+      </w:r>
+      <w:r>
+        <w:t xml:space="preserve"> </w:t>
+      </w:r>
+      <w:r>
+        <w:t xml:space="preserve">on</w:t>
+      </w:r>
+      <w:r>
+        <w:t xml:space="preserve"> </w:t>
+      </w:r>
+      <w:r>
+        <w:t xml:space="preserve">Set Visualization</w:t>
+      </w:r>
+      <w:r>
+        <w:t xml:space="preserve"> </w:t>
+      </w:r>
+      <w:r>
+        <w:t xml:space="preserve">and</w:t>
+      </w:r>
+      <w:r>
+        <w:t xml:space="preserve"> </w:t>
+      </w:r>
+      <w:r>
+        <w:t xml:space="preserve">Reasoning</w:t>
+      </w:r>
+      <w:r>
+        <w:t xml:space="preserve"> </w:t>
+      </w:r>
+      <w:r>
+        <w:t xml:space="preserve">[Internet].</w:t>
+      </w:r>
+      <w:r>
+        <w:t xml:space="preserve"> </w:t>
+      </w:r>
+      <w:r>
+        <w:t xml:space="preserve">Edinburgh, United Kingdom</w:t>
+      </w:r>
+      <w:r>
+        <w:t xml:space="preserve">:</w:t>
+      </w:r>
+      <w:r>
+        <w:t xml:space="preserve"> </w:t>
+      </w:r>
+      <w:r>
+        <w:t xml:space="preserve">CEUR Workshop Proceedings</w:t>
+      </w:r>
+      <w:r>
+        <w:t xml:space="preserve">; 2018. p. 84–91. Available from:</w:t>
       </w:r>
       <w:r>
         <w:t xml:space="preserve"> </w:t>
@@ -1355,12 +1651,12 @@
           <w:rPr>
             <w:rStyle w:val="Hyperlink"/>
           </w:rPr>
-          <w:t xml:space="preserve">https://CRAN.R-project.org/package=finalfit</w:t>
+          <w:t xml:space="preserve">https://ceur-ws.org/Vol-2116/paper7.pdf</w:t>
         </w:r>
       </w:hyperlink>
     </w:p>
     <w:bookmarkEnd w:id="28"/>
-    <w:bookmarkStart w:id="30" w:name="ref-flextable"/>
+    <w:bookmarkStart w:id="30" w:name="ref-factoextra"/>
     <w:p>
       <w:pPr>
         <w:pStyle w:val="Bibliography"/>
@@ -1375,16 +1671,16 @@
         <w:t xml:space="preserve">	</w:t>
       </w:r>
       <w:r>
-        <w:t xml:space="preserve">Gohel D, Skintzos P.</w:t>
-      </w:r>
-      <w:r>
-        <w:t xml:space="preserve"> </w:t>
-      </w:r>
-      <w:r>
-        <w:t xml:space="preserve">flextable</w:t>
-      </w:r>
-      <w:r>
-        <w:t xml:space="preserve">: Functions for tabular reporting [Internet]. 2025. Available from:</w:t>
+        <w:t xml:space="preserve">Kassambara A, Mundt F.</w:t>
+      </w:r>
+      <w:r>
+        <w:t xml:space="preserve"> </w:t>
+      </w:r>
+      <w:r>
+        <w:t xml:space="preserve">factoextra</w:t>
+      </w:r>
+      <w:r>
+        <w:t xml:space="preserve">: Extract and visualize the results of multivariate data analyses [Internet]. 2020. Available from:</w:t>
       </w:r>
       <w:r>
         <w:t xml:space="preserve"> </w:t>
@@ -1394,12 +1690,12 @@
           <w:rPr>
             <w:rStyle w:val="Hyperlink"/>
           </w:rPr>
-          <w:t xml:space="preserve">https://CRAN.R-project.org/package=flextable</w:t>
+          <w:t xml:space="preserve">https://CRAN.R-project.org/package=factoextra</w:t>
         </w:r>
       </w:hyperlink>
     </w:p>
     <w:bookmarkEnd w:id="30"/>
-    <w:bookmarkStart w:id="32" w:name="ref-ggeffects"/>
+    <w:bookmarkStart w:id="32" w:name="ref-finalfit"/>
     <w:p>
       <w:pPr>
         <w:pStyle w:val="Bibliography"/>
@@ -1414,7 +1710,16 @@
         <w:t xml:space="preserve">	</w:t>
       </w:r>
       <w:r>
-        <w:t xml:space="preserve">Lüdecke D.</w:t>
+        <w:t xml:space="preserve">Harrison E, Drake T, Pius R.</w:t>
+      </w:r>
+      <w:r>
+        <w:t xml:space="preserve"> </w:t>
+      </w:r>
+      <w:r>
+        <w:t xml:space="preserve">finalfit</w:t>
+      </w:r>
+      <w:r>
+        <w:t xml:space="preserve">: Quickly create elegant regression results tables and plots when modelling [Internet]. 2024. Available from:</w:t>
       </w:r>
       <w:r>
         <w:t xml:space="preserve"> </w:t>
@@ -1424,24 +1729,12 @@
           <w:rPr>
             <w:rStyle w:val="Hyperlink"/>
           </w:rPr>
-          <w:t xml:space="preserve">ggeffects</w:t>
-        </w:r>
-        <w:r>
-          <w:rPr>
-            <w:rStyle w:val="Hyperlink"/>
-          </w:rPr>
-          <w:t xml:space="preserve">: Tidy data frames of marginal effects from regression models.</w:t>
+          <w:t xml:space="preserve">https://CRAN.R-project.org/package=finalfit</w:t>
         </w:r>
       </w:hyperlink>
-      <w:r>
-        <w:t xml:space="preserve"> Journal of Open Source Software. 2018;3(26):772.</w:t>
-      </w:r>
-      <w:r>
-        <w:t xml:space="preserve"> </w:t>
-      </w:r>
     </w:p>
     <w:bookmarkEnd w:id="32"/>
-    <w:bookmarkStart w:id="34" w:name="ref-ggpubr"/>
+    <w:bookmarkStart w:id="34" w:name="ref-flextable"/>
     <w:p>
       <w:pPr>
         <w:pStyle w:val="Bibliography"/>
@@ -1456,34 +1749,16 @@
         <w:t xml:space="preserve">	</w:t>
       </w:r>
       <w:r>
-        <w:t xml:space="preserve">Kassambara A.</w:t>
-      </w:r>
-      <w:r>
-        <w:t xml:space="preserve"> </w:t>
-      </w:r>
-      <w:r>
-        <w:t xml:space="preserve">ggpubr</w:t>
-      </w:r>
-      <w:r>
-        <w:t xml:space="preserve">:</w:t>
-      </w:r>
-      <w:r>
-        <w:t xml:space="preserve"> </w:t>
-      </w:r>
-      <w:r>
-        <w:t xml:space="preserve">“</w:t>
-      </w:r>
-      <w:r>
-        <w:t xml:space="preserve">ggplot2</w:t>
-      </w:r>
-      <w:r>
-        <w:t xml:space="preserve">”</w:t>
-      </w:r>
-      <w:r>
-        <w:t xml:space="preserve"> </w:t>
-      </w:r>
-      <w:r>
-        <w:t xml:space="preserve">based publication ready plots [Internet]. 2025. Available from:</w:t>
+        <w:t xml:space="preserve">Gohel D, Skintzos P.</w:t>
+      </w:r>
+      <w:r>
+        <w:t xml:space="preserve"> </w:t>
+      </w:r>
+      <w:r>
+        <w:t xml:space="preserve">flextable</w:t>
+      </w:r>
+      <w:r>
+        <w:t xml:space="preserve">: Functions for tabular reporting [Internet]. 2025. Available from:</w:t>
       </w:r>
       <w:r>
         <w:t xml:space="preserve"> </w:t>
@@ -1493,12 +1768,12 @@
           <w:rPr>
             <w:rStyle w:val="Hyperlink"/>
           </w:rPr>
-          <w:t xml:space="preserve">https://CRAN.R-project.org/package=ggpubr</w:t>
+          <w:t xml:space="preserve">https://CRAN.R-project.org/package=flextable</w:t>
         </w:r>
       </w:hyperlink>
     </w:p>
     <w:bookmarkEnd w:id="34"/>
-    <w:bookmarkStart w:id="36" w:name="ref-ggtext"/>
+    <w:bookmarkStart w:id="36" w:name="ref-FSA"/>
     <w:p>
       <w:pPr>
         <w:pStyle w:val="Bibliography"/>
@@ -1513,34 +1788,16 @@
         <w:t xml:space="preserve">	</w:t>
       </w:r>
       <w:r>
-        <w:t xml:space="preserve">Wilke CO, Wiernik BM.</w:t>
-      </w:r>
-      <w:r>
-        <w:t xml:space="preserve"> </w:t>
-      </w:r>
-      <w:r>
-        <w:t xml:space="preserve">ggtext</w:t>
-      </w:r>
-      <w:r>
-        <w:t xml:space="preserve">: Improved text rendering support for</w:t>
-      </w:r>
-      <w:r>
-        <w:t xml:space="preserve"> </w:t>
-      </w:r>
-      <w:r>
-        <w:t xml:space="preserve">“</w:t>
-      </w:r>
-      <w:r>
-        <w:t xml:space="preserve">ggplot2</w:t>
-      </w:r>
-      <w:r>
-        <w:t xml:space="preserve">”</w:t>
-      </w:r>
-      <w:r>
-        <w:t xml:space="preserve"> </w:t>
-      </w:r>
-      <w:r>
-        <w:t xml:space="preserve">[Internet]. 2022. Available from:</w:t>
+        <w:t xml:space="preserve">Ogle DH, Doll JC, Wheeler AP, Dinno A.</w:t>
+      </w:r>
+      <w:r>
+        <w:t xml:space="preserve"> </w:t>
+      </w:r>
+      <w:r>
+        <w:t xml:space="preserve">FSA</w:t>
+      </w:r>
+      <w:r>
+        <w:t xml:space="preserve">: Simple fisheries stock assessment methods [Internet]. 2026. Available from:</w:t>
       </w:r>
       <w:r>
         <w:t xml:space="preserve"> </w:t>
@@ -1550,12 +1807,12 @@
           <w:rPr>
             <w:rStyle w:val="Hyperlink"/>
           </w:rPr>
-          <w:t xml:space="preserve">https://CRAN.R-project.org/package=ggtext</w:t>
+          <w:t xml:space="preserve">https://CRAN.R-project.org/package=FSA</w:t>
         </w:r>
       </w:hyperlink>
     </w:p>
     <w:bookmarkEnd w:id="36"/>
-    <w:bookmarkStart w:id="38" w:name="ref-gtsummary"/>
+    <w:bookmarkStart w:id="38" w:name="ref-ggeffects"/>
     <w:p>
       <w:pPr>
         <w:pStyle w:val="Bibliography"/>
@@ -1570,19 +1827,7 @@
         <w:t xml:space="preserve">	</w:t>
       </w:r>
       <w:r>
-        <w:t xml:space="preserve">Sjoberg DD, Whiting K, Curry M, Lavery JA, Larmarange J. Reproducible summary tables with the gtsummary package.</w:t>
-      </w:r>
-      <w:r>
-        <w:t xml:space="preserve"> </w:t>
-      </w:r>
-      <w:r>
-        <w:t xml:space="preserve">The R Journal</w:t>
-      </w:r>
-      <w:r>
-        <w:t xml:space="preserve"> </w:t>
-      </w:r>
-      <w:r>
-        <w:t xml:space="preserve">[Internet]. 2021;13:570–80. Available from:</w:t>
+        <w:t xml:space="preserve">Lüdecke D.</w:t>
       </w:r>
       <w:r>
         <w:t xml:space="preserve"> </w:t>
@@ -1592,12 +1837,24 @@
           <w:rPr>
             <w:rStyle w:val="Hyperlink"/>
           </w:rPr>
-          <w:t xml:space="preserve">https://doi.org/10.32614/RJ-2021-053</w:t>
+          <w:t xml:space="preserve">ggeffects</w:t>
+        </w:r>
+        <w:r>
+          <w:rPr>
+            <w:rStyle w:val="Hyperlink"/>
+          </w:rPr>
+          <w:t xml:space="preserve">: Tidy data frames of marginal effects from regression models.</w:t>
         </w:r>
       </w:hyperlink>
+      <w:r>
+        <w:t xml:space="preserve"> Journal of Open Source Software. 2018;3(26):772.</w:t>
+      </w:r>
+      <w:r>
+        <w:t xml:space="preserve"> </w:t>
+      </w:r>
     </w:p>
     <w:bookmarkEnd w:id="38"/>
-    <w:bookmarkStart w:id="40" w:name="ref-here"/>
+    <w:bookmarkStart w:id="40" w:name="ref-ggpubr"/>
     <w:p>
       <w:pPr>
         <w:pStyle w:val="Bibliography"/>
@@ -1612,16 +1869,34 @@
         <w:t xml:space="preserve">	</w:t>
       </w:r>
       <w:r>
-        <w:t xml:space="preserve">Müller K.</w:t>
-      </w:r>
-      <w:r>
-        <w:t xml:space="preserve"> </w:t>
-      </w:r>
-      <w:r>
-        <w:t xml:space="preserve">here</w:t>
-      </w:r>
-      <w:r>
-        <w:t xml:space="preserve">: A simpler way to find your files [Internet]. 2020. Available from:</w:t>
+        <w:t xml:space="preserve">Kassambara A.</w:t>
+      </w:r>
+      <w:r>
+        <w:t xml:space="preserve"> </w:t>
+      </w:r>
+      <w:r>
+        <w:t xml:space="preserve">ggpubr</w:t>
+      </w:r>
+      <w:r>
+        <w:t xml:space="preserve">:</w:t>
+      </w:r>
+      <w:r>
+        <w:t xml:space="preserve"> </w:t>
+      </w:r>
+      <w:r>
+        <w:t xml:space="preserve">“</w:t>
+      </w:r>
+      <w:r>
+        <w:t xml:space="preserve">ggplot2</w:t>
+      </w:r>
+      <w:r>
+        <w:t xml:space="preserve">”</w:t>
+      </w:r>
+      <w:r>
+        <w:t xml:space="preserve"> </w:t>
+      </w:r>
+      <w:r>
+        <w:t xml:space="preserve">based publication ready plots [Internet]. 2025. Available from:</w:t>
       </w:r>
       <w:r>
         <w:t xml:space="preserve"> </w:t>
@@ -1631,12 +1906,12 @@
           <w:rPr>
             <w:rStyle w:val="Hyperlink"/>
           </w:rPr>
-          <w:t xml:space="preserve">https://CRAN.R-project.org/package=here</w:t>
+          <w:t xml:space="preserve">https://CRAN.R-project.org/package=ggpubr</w:t>
         </w:r>
       </w:hyperlink>
     </w:p>
     <w:bookmarkEnd w:id="40"/>
-    <w:bookmarkStart w:id="42" w:name="ref-Hmisc"/>
+    <w:bookmarkStart w:id="42" w:name="ref-ggsci"/>
     <w:p>
       <w:pPr>
         <w:pStyle w:val="Bibliography"/>
@@ -1651,16 +1926,34 @@
         <w:t xml:space="preserve">	</w:t>
       </w:r>
       <w:r>
-        <w:t xml:space="preserve">Harrell Jr FE.</w:t>
-      </w:r>
-      <w:r>
-        <w:t xml:space="preserve"> </w:t>
-      </w:r>
-      <w:r>
-        <w:t xml:space="preserve">Hmisc</w:t>
-      </w:r>
-      <w:r>
-        <w:t xml:space="preserve">: Harrell miscellaneous [Internet]. 2025. Available from:</w:t>
+        <w:t xml:space="preserve">Xiao N.</w:t>
+      </w:r>
+      <w:r>
+        <w:t xml:space="preserve"> </w:t>
+      </w:r>
+      <w:r>
+        <w:t xml:space="preserve">ggsci</w:t>
+      </w:r>
+      <w:r>
+        <w:t xml:space="preserve">: Scientific journal and sci-fi themed color palettes for</w:t>
+      </w:r>
+      <w:r>
+        <w:t xml:space="preserve"> </w:t>
+      </w:r>
+      <w:r>
+        <w:t xml:space="preserve">“</w:t>
+      </w:r>
+      <w:r>
+        <w:t xml:space="preserve">ggplot2</w:t>
+      </w:r>
+      <w:r>
+        <w:t xml:space="preserve">”</w:t>
+      </w:r>
+      <w:r>
+        <w:t xml:space="preserve"> </w:t>
+      </w:r>
+      <w:r>
+        <w:t xml:space="preserve">[Internet]. 2024. Available from:</w:t>
       </w:r>
       <w:r>
         <w:t xml:space="preserve"> </w:t>
@@ -1670,12 +1963,12 @@
           <w:rPr>
             <w:rStyle w:val="Hyperlink"/>
           </w:rPr>
-          <w:t xml:space="preserve">https://CRAN.R-project.org/package=Hmisc</w:t>
+          <w:t xml:space="preserve">https://CRAN.R-project.org/package=ggsci</w:t>
         </w:r>
       </w:hyperlink>
     </w:p>
     <w:bookmarkEnd w:id="42"/>
-    <w:bookmarkStart w:id="44" w:name="ref-janitor"/>
+    <w:bookmarkStart w:id="44" w:name="ref-ggtext"/>
     <w:p>
       <w:pPr>
         <w:pStyle w:val="Bibliography"/>
@@ -1690,16 +1983,34 @@
         <w:t xml:space="preserve">	</w:t>
       </w:r>
       <w:r>
-        <w:t xml:space="preserve">Firke S.</w:t>
-      </w:r>
-      <w:r>
-        <w:t xml:space="preserve"> </w:t>
-      </w:r>
-      <w:r>
-        <w:t xml:space="preserve">janitor</w:t>
-      </w:r>
-      <w:r>
-        <w:t xml:space="preserve">: Simple tools for examining and cleaning dirty data [Internet]. 2024. Available from:</w:t>
+        <w:t xml:space="preserve">Wilke CO, Wiernik BM.</w:t>
+      </w:r>
+      <w:r>
+        <w:t xml:space="preserve"> </w:t>
+      </w:r>
+      <w:r>
+        <w:t xml:space="preserve">ggtext</w:t>
+      </w:r>
+      <w:r>
+        <w:t xml:space="preserve">: Improved text rendering support for</w:t>
+      </w:r>
+      <w:r>
+        <w:t xml:space="preserve"> </w:t>
+      </w:r>
+      <w:r>
+        <w:t xml:space="preserve">“</w:t>
+      </w:r>
+      <w:r>
+        <w:t xml:space="preserve">ggplot2</w:t>
+      </w:r>
+      <w:r>
+        <w:t xml:space="preserve">”</w:t>
+      </w:r>
+      <w:r>
+        <w:t xml:space="preserve"> </w:t>
+      </w:r>
+      <w:r>
+        <w:t xml:space="preserve">[Internet]. 2022. Available from:</w:t>
       </w:r>
       <w:r>
         <w:t xml:space="preserve"> </w:t>
@@ -1709,12 +2020,12 @@
           <w:rPr>
             <w:rStyle w:val="Hyperlink"/>
           </w:rPr>
-          <w:t xml:space="preserve">https://CRAN.R-project.org/package=janitor</w:t>
+          <w:t xml:space="preserve">https://CRAN.R-project.org/package=ggtext</w:t>
         </w:r>
       </w:hyperlink>
     </w:p>
     <w:bookmarkEnd w:id="44"/>
-    <w:bookmarkStart w:id="45" w:name="ref-mgcv2003"/>
+    <w:bookmarkStart w:id="46" w:name="ref-Gifi"/>
     <w:p>
       <w:pPr>
         <w:pStyle w:val="Bibliography"/>
@@ -1729,42 +2040,37 @@
         <w:t xml:space="preserve">	</w:t>
       </w:r>
       <w:r>
-        <w:t xml:space="preserve">Wood SN. Thin-plate regression splines. Journal of the Royal Statistical Society (B). 2003;65(1):95–114.</w:t>
-      </w:r>
-      <w:r>
-        <w:t xml:space="preserve"> </w:t>
-      </w:r>
-    </w:p>
-    <w:bookmarkEnd w:id="45"/>
-    <w:bookmarkStart w:id="46" w:name="ref-mgcv2004"/>
-    <w:p>
-      <w:pPr>
-        <w:pStyle w:val="Bibliography"/>
-      </w:pPr>
-      <w:r>
-        <w:t xml:space="preserve">14.</w:t>
-      </w:r>
-      <w:r>
-        <w:t xml:space="preserve"> </w:t>
-      </w:r>
-      <w:r>
-        <w:t xml:space="preserve">	</w:t>
-      </w:r>
-      <w:r>
-        <w:t xml:space="preserve">Wood SN. Stable and efficient multiple smoothing parameter estimation for generalized additive models. Journal of the American Statistical Association. 2004;99(467):673–86.</w:t>
-      </w:r>
-      <w:r>
-        <w:t xml:space="preserve"> </w:t>
-      </w:r>
+        <w:t xml:space="preserve">Mair P, De Leeuw J.</w:t>
+      </w:r>
+      <w:r>
+        <w:t xml:space="preserve"> </w:t>
+      </w:r>
+      <w:r>
+        <w:t xml:space="preserve">Gifi</w:t>
+      </w:r>
+      <w:r>
+        <w:t xml:space="preserve">: Multivariate analysis with optimal scaling [Internet]. 2025. Available from:</w:t>
+      </w:r>
+      <w:r>
+        <w:t xml:space="preserve"> </w:t>
+      </w:r>
+      <w:hyperlink r:id="rId45">
+        <w:r>
+          <w:rPr>
+            <w:rStyle w:val="Hyperlink"/>
+          </w:rPr>
+          <w:t xml:space="preserve">https://CRAN.R-project.org/package=Gifi</w:t>
+        </w:r>
+      </w:hyperlink>
     </w:p>
     <w:bookmarkEnd w:id="46"/>
-    <w:bookmarkStart w:id="47" w:name="ref-mgcv2011"/>
+    <w:bookmarkStart w:id="48" w:name="ref-gtsummary"/>
     <w:p>
       <w:pPr>
         <w:pStyle w:val="Bibliography"/>
       </w:pPr>
       <w:r>
-        <w:t xml:space="preserve">15.</w:t>
+        <w:t xml:space="preserve">14.</w:t>
       </w:r>
       <w:r>
         <w:t xml:space="preserve"> </w:t>
@@ -1773,42 +2079,40 @@
         <w:t xml:space="preserve">	</w:t>
       </w:r>
       <w:r>
-        <w:t xml:space="preserve">Wood SN. Fast stable restricted maximum likelihood and marginal likelihood estimation of semiparametric generalized linear models. Journal of the Royal Statistical Society (B). 2011;73(1):3–36.</w:t>
-      </w:r>
-      <w:r>
-        <w:t xml:space="preserve"> </w:t>
-      </w:r>
-    </w:p>
-    <w:bookmarkEnd w:id="47"/>
-    <w:bookmarkStart w:id="48" w:name="ref-mgcv2016"/>
-    <w:p>
-      <w:pPr>
-        <w:pStyle w:val="Bibliography"/>
-      </w:pPr>
-      <w:r>
-        <w:t xml:space="preserve">16.</w:t>
-      </w:r>
-      <w:r>
-        <w:t xml:space="preserve"> </w:t>
-      </w:r>
-      <w:r>
-        <w:t xml:space="preserve">	</w:t>
-      </w:r>
-      <w:r>
-        <w:t xml:space="preserve">Wood SN, N., Pya, S"afken B. Smoothing parameter and model selection for general smooth models (with discussion). Journal of the American Statistical Association. 2016;111:1548–75.</w:t>
-      </w:r>
-      <w:r>
-        <w:t xml:space="preserve"> </w:t>
-      </w:r>
+        <w:t xml:space="preserve">Sjoberg DD, Whiting K, Curry M, Lavery JA, Larmarange J. Reproducible summary tables with the gtsummary package.</w:t>
+      </w:r>
+      <w:r>
+        <w:t xml:space="preserve"> </w:t>
+      </w:r>
+      <w:r>
+        <w:t xml:space="preserve">The R Journal</w:t>
+      </w:r>
+      <w:r>
+        <w:t xml:space="preserve"> </w:t>
+      </w:r>
+      <w:r>
+        <w:t xml:space="preserve">[Internet]. 2021;13:570–80. Available from:</w:t>
+      </w:r>
+      <w:r>
+        <w:t xml:space="preserve"> </w:t>
+      </w:r>
+      <w:hyperlink r:id="rId47">
+        <w:r>
+          <w:rPr>
+            <w:rStyle w:val="Hyperlink"/>
+          </w:rPr>
+          <w:t xml:space="preserve">https://doi.org/10.32614/RJ-2021-053</w:t>
+        </w:r>
+      </w:hyperlink>
     </w:p>
     <w:bookmarkEnd w:id="48"/>
-    <w:bookmarkStart w:id="49" w:name="ref-mgcv2017"/>
+    <w:bookmarkStart w:id="50" w:name="ref-here"/>
     <w:p>
       <w:pPr>
         <w:pStyle w:val="Bibliography"/>
       </w:pPr>
       <w:r>
-        <w:t xml:space="preserve">17.</w:t>
+        <w:t xml:space="preserve">15.</w:t>
       </w:r>
       <w:r>
         <w:t xml:space="preserve"> </w:t>
@@ -1817,59 +2121,37 @@
         <w:t xml:space="preserve">	</w:t>
       </w:r>
       <w:r>
-        <w:t xml:space="preserve">Wood SN. Generalized additive models: An introduction with r. 2nd ed. Chapman; Hall/CRC; 2017.</w:t>
-      </w:r>
-      <w:r>
-        <w:t xml:space="preserve"> </w:t>
-      </w:r>
-    </w:p>
-    <w:bookmarkEnd w:id="49"/>
-    <w:bookmarkStart w:id="51" w:name="ref-officer"/>
-    <w:p>
-      <w:pPr>
-        <w:pStyle w:val="Bibliography"/>
-      </w:pPr>
-      <w:r>
-        <w:t xml:space="preserve">18.</w:t>
-      </w:r>
-      <w:r>
-        <w:t xml:space="preserve"> </w:t>
-      </w:r>
-      <w:r>
-        <w:t xml:space="preserve">	</w:t>
-      </w:r>
-      <w:r>
-        <w:t xml:space="preserve">Gohel D, Moog S, Heckmann M.</w:t>
-      </w:r>
-      <w:r>
-        <w:t xml:space="preserve"> </w:t>
-      </w:r>
-      <w:r>
-        <w:t xml:space="preserve">officer</w:t>
-      </w:r>
-      <w:r>
-        <w:t xml:space="preserve">: Manipulation of microsoft word and PowerPoint documents [Internet]. 2025. Available from:</w:t>
-      </w:r>
-      <w:r>
-        <w:t xml:space="preserve"> </w:t>
-      </w:r>
-      <w:hyperlink r:id="rId50">
-        <w:r>
-          <w:rPr>
-            <w:rStyle w:val="Hyperlink"/>
-          </w:rPr>
-          <w:t xml:space="preserve">https://CRAN.R-project.org/package=officer</w:t>
+        <w:t xml:space="preserve">Müller K.</w:t>
+      </w:r>
+      <w:r>
+        <w:t xml:space="preserve"> </w:t>
+      </w:r>
+      <w:r>
+        <w:t xml:space="preserve">here</w:t>
+      </w:r>
+      <w:r>
+        <w:t xml:space="preserve">: A simpler way to find your files [Internet]. 2020. Available from:</w:t>
+      </w:r>
+      <w:r>
+        <w:t xml:space="preserve"> </w:t>
+      </w:r>
+      <w:hyperlink r:id="rId49">
+        <w:r>
+          <w:rPr>
+            <w:rStyle w:val="Hyperlink"/>
+          </w:rPr>
+          <w:t xml:space="preserve">https://CRAN.R-project.org/package=here</w:t>
         </w:r>
       </w:hyperlink>
     </w:p>
-    <w:bookmarkEnd w:id="51"/>
-    <w:bookmarkStart w:id="53" w:name="ref-pacman"/>
+    <w:bookmarkEnd w:id="50"/>
+    <w:bookmarkStart w:id="52" w:name="ref-Hmisc"/>
     <w:p>
       <w:pPr>
         <w:pStyle w:val="Bibliography"/>
       </w:pPr>
       <w:r>
-        <w:t xml:space="preserve">19.</w:t>
+        <w:t xml:space="preserve">16.</w:t>
       </w:r>
       <w:r>
         <w:t xml:space="preserve"> </w:t>
@@ -1878,58 +2160,37 @@
         <w:t xml:space="preserve">	</w:t>
       </w:r>
       <w:r>
-        <w:t xml:space="preserve">Rinker TW, Kurkiewicz D.</w:t>
-      </w:r>
-      <w:r>
-        <w:t xml:space="preserve"> </w:t>
-      </w:r>
-      <w:r>
-        <w:t xml:space="preserve">pacman</w:t>
-      </w:r>
-      <w:r>
-        <w:t xml:space="preserve">:</w:t>
-      </w:r>
-      <w:r>
-        <w:t xml:space="preserve"> </w:t>
-      </w:r>
-      <w:r>
-        <w:t xml:space="preserve">P</w:t>
-      </w:r>
-      <w:r>
-        <w:t xml:space="preserve">ackage management for</w:t>
-      </w:r>
-      <w:r>
-        <w:t xml:space="preserve"> </w:t>
-      </w:r>
-      <w:r>
-        <w:t xml:space="preserve">R</w:t>
-      </w:r>
-      <w:r>
-        <w:t xml:space="preserve"> </w:t>
-      </w:r>
-      <w:r>
-        <w:t xml:space="preserve">[Internet]. Buffalo, New York; 2018. Available from:</w:t>
-      </w:r>
-      <w:r>
-        <w:t xml:space="preserve"> </w:t>
-      </w:r>
-      <w:hyperlink r:id="rId52">
-        <w:r>
-          <w:rPr>
-            <w:rStyle w:val="Hyperlink"/>
-          </w:rPr>
-          <w:t xml:space="preserve">http://github.com/trinker/pacman</w:t>
+        <w:t xml:space="preserve">Harrell Jr FE.</w:t>
+      </w:r>
+      <w:r>
+        <w:t xml:space="preserve"> </w:t>
+      </w:r>
+      <w:r>
+        <w:t xml:space="preserve">Hmisc</w:t>
+      </w:r>
+      <w:r>
+        <w:t xml:space="preserve">: Harrell miscellaneous [Internet]. 2025. Available from:</w:t>
+      </w:r>
+      <w:r>
+        <w:t xml:space="preserve"> </w:t>
+      </w:r>
+      <w:hyperlink r:id="rId51">
+        <w:r>
+          <w:rPr>
+            <w:rStyle w:val="Hyperlink"/>
+          </w:rPr>
+          <w:t xml:space="preserve">https://CRAN.R-project.org/package=Hmisc</w:t>
         </w:r>
       </w:hyperlink>
     </w:p>
-    <w:bookmarkEnd w:id="53"/>
-    <w:bookmarkStart w:id="55" w:name="ref-performance"/>
+    <w:bookmarkEnd w:id="52"/>
+    <w:bookmarkStart w:id="54" w:name="ref-janitor"/>
     <w:p>
       <w:pPr>
         <w:pStyle w:val="Bibliography"/>
       </w:pPr>
       <w:r>
-        <w:t xml:space="preserve">20.</w:t>
+        <w:t xml:space="preserve">17.</w:t>
       </w:r>
       <w:r>
         <w:t xml:space="preserve"> </w:t>
@@ -1938,64 +2199,59 @@
         <w:t xml:space="preserve">	</w:t>
       </w:r>
       <w:r>
-        <w:t xml:space="preserve">Lüdecke D, Ben-Shachar MS, Patil I, Waggoner P, Makowski D.</w:t>
-      </w:r>
-      <w:r>
-        <w:t xml:space="preserve"> </w:t>
-      </w:r>
-      <w:hyperlink r:id="rId54">
-        <w:r>
-          <w:rPr>
-            <w:rStyle w:val="Hyperlink"/>
-          </w:rPr>
-          <w:t xml:space="preserve">performance</w:t>
-        </w:r>
-        <w:r>
-          <w:rPr>
-            <w:rStyle w:val="Hyperlink"/>
-          </w:rPr>
-          <w:t xml:space="preserve">: An</w:t>
-        </w:r>
-        <w:r>
-          <w:rPr>
-            <w:rStyle w:val="Hyperlink"/>
-          </w:rPr>
-          <w:t xml:space="preserve"> </w:t>
-        </w:r>
-        <w:r>
-          <w:rPr>
-            <w:rStyle w:val="Hyperlink"/>
-          </w:rPr>
-          <w:t xml:space="preserve">R</w:t>
-        </w:r>
-        <w:r>
-          <w:rPr>
-            <w:rStyle w:val="Hyperlink"/>
-          </w:rPr>
-          <w:t xml:space="preserve"> </w:t>
-        </w:r>
-        <w:r>
-          <w:rPr>
-            <w:rStyle w:val="Hyperlink"/>
-          </w:rPr>
-          <w:t xml:space="preserve">package for assessment, comparison and testing of statistical models</w:t>
+        <w:t xml:space="preserve">Firke S.</w:t>
+      </w:r>
+      <w:r>
+        <w:t xml:space="preserve"> </w:t>
+      </w:r>
+      <w:r>
+        <w:t xml:space="preserve">janitor</w:t>
+      </w:r>
+      <w:r>
+        <w:t xml:space="preserve">: Simple tools for examining and cleaning dirty data [Internet]. 2024. Available from:</w:t>
+      </w:r>
+      <w:r>
+        <w:t xml:space="preserve"> </w:t>
+      </w:r>
+      <w:hyperlink r:id="rId53">
+        <w:r>
+          <w:rPr>
+            <w:rStyle w:val="Hyperlink"/>
+          </w:rPr>
+          <w:t xml:space="preserve">https://CRAN.R-project.org/package=janitor</w:t>
         </w:r>
       </w:hyperlink>
-      <w:r>
-        <w:t xml:space="preserve">. Journal of Open Source Software. 2021;6(60):3139.</w:t>
+    </w:p>
+    <w:bookmarkEnd w:id="54"/>
+    <w:bookmarkStart w:id="55" w:name="ref-mgcv2003"/>
+    <w:p>
+      <w:pPr>
+        <w:pStyle w:val="Bibliography"/>
+      </w:pPr>
+      <w:r>
+        <w:t xml:space="preserve">18.</w:t>
+      </w:r>
+      <w:r>
+        <w:t xml:space="preserve"> </w:t>
+      </w:r>
+      <w:r>
+        <w:t xml:space="preserve">	</w:t>
+      </w:r>
+      <w:r>
+        <w:t xml:space="preserve">Wood SN. Thin-plate regression splines. Journal of the Royal Statistical Society (B). 2003;65(1):95–114.</w:t>
       </w:r>
       <w:r>
         <w:t xml:space="preserve"> </w:t>
       </w:r>
     </w:p>
     <w:bookmarkEnd w:id="55"/>
-    <w:bookmarkStart w:id="57" w:name="ref-psych"/>
+    <w:bookmarkStart w:id="56" w:name="ref-mgcv2004"/>
     <w:p>
       <w:pPr>
         <w:pStyle w:val="Bibliography"/>
       </w:pPr>
       <w:r>
-        <w:t xml:space="preserve">21.</w:t>
+        <w:t xml:space="preserve">19.</w:t>
       </w:r>
       <w:r>
         <w:t xml:space="preserve"> </w:t>
@@ -2004,36 +2260,63 @@
         <w:t xml:space="preserve">	</w:t>
       </w:r>
       <w:r>
-        <w:t xml:space="preserve">William Revelle.</w:t>
-      </w:r>
-      <w:r>
-        <w:t xml:space="preserve"> </w:t>
-      </w:r>
-      <w:r>
-        <w:t xml:space="preserve">psych</w:t>
-      </w:r>
-      <w:r>
-        <w:t xml:space="preserve">: Procedures for psychological, psychometric, and personality research [Internet]. Evanston, Illinois: Northwestern University; 2025. Available from:</w:t>
-      </w:r>
-      <w:r>
-        <w:t xml:space="preserve"> </w:t>
-      </w:r>
-      <w:hyperlink r:id="rId56">
-        <w:r>
-          <w:rPr>
-            <w:rStyle w:val="Hyperlink"/>
-          </w:rPr>
-          <w:t xml:space="preserve">https://CRAN.R-project.org/package=psych</w:t>
-        </w:r>
-      </w:hyperlink>
+        <w:t xml:space="preserve">Wood SN. Stable and efficient multiple smoothing parameter estimation for generalized additive models. Journal of the American Statistical Association. 2004;99(467):673–86.</w:t>
+      </w:r>
+      <w:r>
+        <w:t xml:space="preserve"> </w:t>
+      </w:r>
+    </w:p>
+    <w:bookmarkEnd w:id="56"/>
+    <w:bookmarkStart w:id="57" w:name="ref-mgcv2011"/>
+    <w:p>
+      <w:pPr>
+        <w:pStyle w:val="Bibliography"/>
+      </w:pPr>
+      <w:r>
+        <w:t xml:space="preserve">20.</w:t>
+      </w:r>
+      <w:r>
+        <w:t xml:space="preserve"> </w:t>
+      </w:r>
+      <w:r>
+        <w:t xml:space="preserve">	</w:t>
+      </w:r>
+      <w:r>
+        <w:t xml:space="preserve">Wood SN. Fast stable restricted maximum likelihood and marginal likelihood estimation of semiparametric generalized linear models. Journal of the Royal Statistical Society (B). 2011;73(1):3–36.</w:t>
+      </w:r>
+      <w:r>
+        <w:t xml:space="preserve"> </w:t>
+      </w:r>
     </w:p>
     <w:bookmarkEnd w:id="57"/>
-    <w:bookmarkStart w:id="59" w:name="ref-rfextras"/>
+    <w:bookmarkStart w:id="58" w:name="ref-mgcv2016"/>
     <w:p>
       <w:pPr>
         <w:pStyle w:val="Bibliography"/>
       </w:pPr>
       <w:r>
+        <w:t xml:space="preserve">21.</w:t>
+      </w:r>
+      <w:r>
+        <w:t xml:space="preserve"> </w:t>
+      </w:r>
+      <w:r>
+        <w:t xml:space="preserve">	</w:t>
+      </w:r>
+      <w:r>
+        <w:t xml:space="preserve">Wood SN, N., Pya, S"afken B. Smoothing parameter and model selection for general smooth models (with discussion). Journal of the American Statistical Association. 2016;111:1548–75.</w:t>
+      </w:r>
+      <w:r>
+        <w:t xml:space="preserve"> </w:t>
+      </w:r>
+    </w:p>
+    <w:bookmarkEnd w:id="58"/>
+    <w:bookmarkStart w:id="59" w:name="ref-mgcv2017"/>
+    <w:p>
+      <w:pPr>
+        <w:pStyle w:val="Bibliography"/>
+      </w:pPr>
+      <w:r>
         <w:t xml:space="preserve">22.</w:t>
       </w:r>
       <w:r>
@@ -2043,31 +2326,14 @@
         <w:t xml:space="preserve">	</w:t>
       </w:r>
       <w:r>
-        <w:t xml:space="preserve">Jombart T, Taylor T.</w:t>
-      </w:r>
-      <w:r>
-        <w:t xml:space="preserve"> </w:t>
-      </w:r>
-      <w:r>
-        <w:t xml:space="preserve">rfextras</w:t>
-      </w:r>
-      <w:r>
-        <w:t xml:space="preserve">: Extra functionalities for reportfactory [Internet]. 2025. Available from:</w:t>
-      </w:r>
-      <w:r>
-        <w:t xml:space="preserve"> </w:t>
-      </w:r>
-      <w:hyperlink r:id="rId58">
-        <w:r>
-          <w:rPr>
-            <w:rStyle w:val="Hyperlink"/>
-          </w:rPr>
-          <w:t xml:space="preserve">https://github.com/reconhub/rfextras</w:t>
-        </w:r>
-      </w:hyperlink>
+        <w:t xml:space="preserve">Wood SN. Generalized additive models: An introduction with r. 2nd ed. Chapman; Hall/CRC; 2017.</w:t>
+      </w:r>
+      <w:r>
+        <w:t xml:space="preserve"> </w:t>
+      </w:r>
     </w:p>
     <w:bookmarkEnd w:id="59"/>
-    <w:bookmarkStart w:id="61" w:name="ref-rio"/>
+    <w:bookmarkStart w:id="61" w:name="ref-officer"/>
     <w:p>
       <w:pPr>
         <w:pStyle w:val="Bibliography"/>
@@ -2082,16 +2348,16 @@
         <w:t xml:space="preserve">	</w:t>
       </w:r>
       <w:r>
-        <w:t xml:space="preserve">Chan C, Leeper TJ, Becker J, Schoch D.</w:t>
-      </w:r>
-      <w:r>
-        <w:t xml:space="preserve"> </w:t>
-      </w:r>
-      <w:r>
-        <w:t xml:space="preserve">rio</w:t>
-      </w:r>
-      <w:r>
-        <w:t xml:space="preserve">: A swiss-army knife for data file i/o [Internet]. 2023. Available from:</w:t>
+        <w:t xml:space="preserve">Gohel D, Moog S, Heckmann M.</w:t>
+      </w:r>
+      <w:r>
+        <w:t xml:space="preserve"> </w:t>
+      </w:r>
+      <w:r>
+        <w:t xml:space="preserve">officer</w:t>
+      </w:r>
+      <w:r>
+        <w:t xml:space="preserve">: Manipulation of microsoft word and PowerPoint documents [Internet]. 2025. Available from:</w:t>
       </w:r>
       <w:r>
         <w:t xml:space="preserve"> </w:t>
@@ -2101,12 +2367,12 @@
           <w:rPr>
             <w:rStyle w:val="Hyperlink"/>
           </w:rPr>
-          <w:t xml:space="preserve">https://cran.r-project.org/package=rio</w:t>
+          <w:t xml:space="preserve">https://CRAN.R-project.org/package=officer</w:t>
         </w:r>
       </w:hyperlink>
     </w:p>
     <w:bookmarkEnd w:id="61"/>
-    <w:bookmarkStart w:id="63" w:name="ref-rmarkdown2018"/>
+    <w:bookmarkStart w:id="63" w:name="ref-pacman"/>
     <w:p>
       <w:pPr>
         <w:pStyle w:val="Bibliography"/>
@@ -2121,7 +2387,37 @@
         <w:t xml:space="preserve">	</w:t>
       </w:r>
       <w:r>
-        <w:t xml:space="preserve">Xie Y, Allaire JJ, Grolemund G. R markdown: The definitive guide [Internet]. Boca Raton, Florida: Chapman; Hall/CRC; 2018. Available from:</w:t>
+        <w:t xml:space="preserve">Rinker TW, Kurkiewicz D.</w:t>
+      </w:r>
+      <w:r>
+        <w:t xml:space="preserve"> </w:t>
+      </w:r>
+      <w:r>
+        <w:t xml:space="preserve">pacman</w:t>
+      </w:r>
+      <w:r>
+        <w:t xml:space="preserve">:</w:t>
+      </w:r>
+      <w:r>
+        <w:t xml:space="preserve"> </w:t>
+      </w:r>
+      <w:r>
+        <w:t xml:space="preserve">P</w:t>
+      </w:r>
+      <w:r>
+        <w:t xml:space="preserve">ackage management for</w:t>
+      </w:r>
+      <w:r>
+        <w:t xml:space="preserve"> </w:t>
+      </w:r>
+      <w:r>
+        <w:t xml:space="preserve">R</w:t>
+      </w:r>
+      <w:r>
+        <w:t xml:space="preserve"> </w:t>
+      </w:r>
+      <w:r>
+        <w:t xml:space="preserve">[Internet]. Buffalo, New York; 2018. Available from:</w:t>
       </w:r>
       <w:r>
         <w:t xml:space="preserve"> </w:t>
@@ -2131,12 +2427,12 @@
           <w:rPr>
             <w:rStyle w:val="Hyperlink"/>
           </w:rPr>
-          <w:t xml:space="preserve">https://bookdown.org/yihui/rmarkdown</w:t>
+          <w:t xml:space="preserve">http://github.com/trinker/pacman</w:t>
         </w:r>
       </w:hyperlink>
     </w:p>
     <w:bookmarkEnd w:id="63"/>
-    <w:bookmarkStart w:id="65" w:name="ref-rmarkdown2020"/>
+    <w:bookmarkStart w:id="65" w:name="ref-performance"/>
     <w:p>
       <w:pPr>
         <w:pStyle w:val="Bibliography"/>
@@ -2151,7 +2447,7 @@
         <w:t xml:space="preserve">	</w:t>
       </w:r>
       <w:r>
-        <w:t xml:space="preserve">Xie Y, Dervieux C, Riederer E. R markdown cookbook [Internet]. Boca Raton, Florida: Chapman; Hall/CRC; 2020. Available from:</w:t>
+        <w:t xml:space="preserve">Lüdecke D, Ben-Shachar MS, Patil I, Waggoner P, Makowski D.</w:t>
       </w:r>
       <w:r>
         <w:t xml:space="preserve"> </w:t>
@@ -2161,12 +2457,48 @@
           <w:rPr>
             <w:rStyle w:val="Hyperlink"/>
           </w:rPr>
-          <w:t xml:space="preserve">https://bookdown.org/yihui/rmarkdown-cookbook</w:t>
+          <w:t xml:space="preserve">performance</w:t>
+        </w:r>
+        <w:r>
+          <w:rPr>
+            <w:rStyle w:val="Hyperlink"/>
+          </w:rPr>
+          <w:t xml:space="preserve">: An</w:t>
+        </w:r>
+        <w:r>
+          <w:rPr>
+            <w:rStyle w:val="Hyperlink"/>
+          </w:rPr>
+          <w:t xml:space="preserve"> </w:t>
+        </w:r>
+        <w:r>
+          <w:rPr>
+            <w:rStyle w:val="Hyperlink"/>
+          </w:rPr>
+          <w:t xml:space="preserve">R</w:t>
+        </w:r>
+        <w:r>
+          <w:rPr>
+            <w:rStyle w:val="Hyperlink"/>
+          </w:rPr>
+          <w:t xml:space="preserve"> </w:t>
+        </w:r>
+        <w:r>
+          <w:rPr>
+            <w:rStyle w:val="Hyperlink"/>
+          </w:rPr>
+          <w:t xml:space="preserve">package for assessment, comparison and testing of statistical models</w:t>
         </w:r>
       </w:hyperlink>
+      <w:r>
+        <w:t xml:space="preserve">. Journal of Open Source Software. 2021;6(60):3139.</w:t>
+      </w:r>
+      <w:r>
+        <w:t xml:space="preserve"> </w:t>
+      </w:r>
     </w:p>
     <w:bookmarkEnd w:id="65"/>
-    <w:bookmarkStart w:id="67" w:name="ref-rmarkdown2024"/>
+    <w:bookmarkStart w:id="67" w:name="ref-psych"/>
     <w:p>
       <w:pPr>
         <w:pStyle w:val="Bibliography"/>
@@ -2181,16 +2513,16 @@
         <w:t xml:space="preserve">	</w:t>
       </w:r>
       <w:r>
-        <w:t xml:space="preserve">Allaire J, Xie Y, Dervieux C, McPherson J, Luraschi J, Ushey K, et al.</w:t>
-      </w:r>
-      <w:r>
-        <w:t xml:space="preserve"> </w:t>
-      </w:r>
-      <w:r>
-        <w:t xml:space="preserve">rmarkdown</w:t>
-      </w:r>
-      <w:r>
-        <w:t xml:space="preserve">: Dynamic documents for r [Internet]. 2024. Available from:</w:t>
+        <w:t xml:space="preserve">William Revelle.</w:t>
+      </w:r>
+      <w:r>
+        <w:t xml:space="preserve"> </w:t>
+      </w:r>
+      <w:r>
+        <w:t xml:space="preserve">psych</w:t>
+      </w:r>
+      <w:r>
+        <w:t xml:space="preserve">: Procedures for psychological, psychometric, and personality research [Internet]. Evanston, Illinois: Northwestern University; 2025. Available from:</w:t>
       </w:r>
       <w:r>
         <w:t xml:space="preserve"> </w:t>
@@ -2200,12 +2532,12 @@
           <w:rPr>
             <w:rStyle w:val="Hyperlink"/>
           </w:rPr>
-          <w:t xml:space="preserve">https://github.com/rstudio/rmarkdown</w:t>
+          <w:t xml:space="preserve">https://CRAN.R-project.org/package=psych</w:t>
         </w:r>
       </w:hyperlink>
     </w:p>
     <w:bookmarkEnd w:id="67"/>
-    <w:bookmarkStart w:id="69" w:name="ref-rms"/>
+    <w:bookmarkStart w:id="69" w:name="ref-rcompanion"/>
     <w:p>
       <w:pPr>
         <w:pStyle w:val="Bibliography"/>
@@ -2220,16 +2552,16 @@
         <w:t xml:space="preserve">	</w:t>
       </w:r>
       <w:r>
-        <w:t xml:space="preserve">Harrell Jr FE.</w:t>
-      </w:r>
-      <w:r>
-        <w:t xml:space="preserve"> </w:t>
-      </w:r>
-      <w:r>
-        <w:t xml:space="preserve">rms</w:t>
-      </w:r>
-      <w:r>
-        <w:t xml:space="preserve">: Regression modeling strategies [Internet]. 2025. Available from:</w:t>
+        <w:t xml:space="preserve">Mangiafico SS.</w:t>
+      </w:r>
+      <w:r>
+        <w:t xml:space="preserve"> </w:t>
+      </w:r>
+      <w:r>
+        <w:t xml:space="preserve">rcompanion</w:t>
+      </w:r>
+      <w:r>
+        <w:t xml:space="preserve">: Functions to support extension education program evaluation [Internet]. New Brunswick, New Jersey: Rutgers Cooperative Extension; 2026. Available from:</w:t>
       </w:r>
       <w:r>
         <w:t xml:space="preserve"> </w:t>
@@ -2239,12 +2571,12 @@
           <w:rPr>
             <w:rStyle w:val="Hyperlink"/>
           </w:rPr>
-          <w:t xml:space="preserve">https://CRAN.R-project.org/package=rms</w:t>
+          <w:t xml:space="preserve">https://CRAN.R-project.org/package=rcompanion/</w:t>
         </w:r>
       </w:hyperlink>
     </w:p>
     <w:bookmarkEnd w:id="69"/>
-    <w:bookmarkStart w:id="71" w:name="ref-tidyverse"/>
+    <w:bookmarkStart w:id="71" w:name="ref-rio"/>
     <w:p>
       <w:pPr>
         <w:pStyle w:val="Bibliography"/>
@@ -2259,7 +2591,16 @@
         <w:t xml:space="preserve">	</w:t>
       </w:r>
       <w:r>
-        <w:t xml:space="preserve">Wickham H, Averick M, Bryan J, Chang W, McGowan LD, François R, et al.</w:t>
+        <w:t xml:space="preserve">Chan C, Leeper TJ, Becker J, Schoch D.</w:t>
+      </w:r>
+      <w:r>
+        <w:t xml:space="preserve"> </w:t>
+      </w:r>
+      <w:r>
+        <w:t xml:space="preserve">rio</w:t>
+      </w:r>
+      <w:r>
+        <w:t xml:space="preserve">: A swiss-army knife for data file i/o [Internet]. 2023. Available from:</w:t>
       </w:r>
       <w:r>
         <w:t xml:space="preserve"> </w:t>
@@ -2269,31 +2610,199 @@
           <w:rPr>
             <w:rStyle w:val="Hyperlink"/>
           </w:rPr>
-          <w:t xml:space="preserve">Welcome to the</w:t>
-        </w:r>
-        <w:r>
-          <w:rPr>
-            <w:rStyle w:val="Hyperlink"/>
-          </w:rPr>
-          <w:t xml:space="preserve"> </w:t>
-        </w:r>
-        <w:r>
-          <w:rPr>
-            <w:rStyle w:val="Hyperlink"/>
-          </w:rPr>
-          <w:t xml:space="preserve">tidyverse</w:t>
+          <w:t xml:space="preserve">https://cran.r-project.org/package=rio</w:t>
         </w:r>
       </w:hyperlink>
-      <w:r>
-        <w:t xml:space="preserve">. Journal of Open Source Software. 2019;4(43):1686.</w:t>
-      </w:r>
-      <w:r>
-        <w:t xml:space="preserve"> </w:t>
-      </w:r>
     </w:p>
     <w:bookmarkEnd w:id="71"/>
-    <w:bookmarkEnd w:id="72"/>
+    <w:bookmarkStart w:id="73" w:name="ref-rmarkdown2018"/>
+    <w:p>
+      <w:pPr>
+        <w:pStyle w:val="Bibliography"/>
+      </w:pPr>
+      <w:r>
+        <w:t xml:space="preserve">29.</w:t>
+      </w:r>
+      <w:r>
+        <w:t xml:space="preserve"> </w:t>
+      </w:r>
+      <w:r>
+        <w:t xml:space="preserve">	</w:t>
+      </w:r>
+      <w:r>
+        <w:t xml:space="preserve">Xie Y, Allaire JJ, Grolemund G. R markdown: The definitive guide [Internet]. Boca Raton, Florida: Chapman; Hall/CRC; 2018. Available from:</w:t>
+      </w:r>
+      <w:r>
+        <w:t xml:space="preserve"> </w:t>
+      </w:r>
+      <w:hyperlink r:id="rId72">
+        <w:r>
+          <w:rPr>
+            <w:rStyle w:val="Hyperlink"/>
+          </w:rPr>
+          <w:t xml:space="preserve">https://bookdown.org/yihui/rmarkdown</w:t>
+        </w:r>
+      </w:hyperlink>
+    </w:p>
     <w:bookmarkEnd w:id="73"/>
+    <w:bookmarkStart w:id="75" w:name="ref-rmarkdown2020"/>
+    <w:p>
+      <w:pPr>
+        <w:pStyle w:val="Bibliography"/>
+      </w:pPr>
+      <w:r>
+        <w:t xml:space="preserve">30.</w:t>
+      </w:r>
+      <w:r>
+        <w:t xml:space="preserve"> </w:t>
+      </w:r>
+      <w:r>
+        <w:t xml:space="preserve">	</w:t>
+      </w:r>
+      <w:r>
+        <w:t xml:space="preserve">Xie Y, Dervieux C, Riederer E. R markdown cookbook [Internet]. Boca Raton, Florida: Chapman; Hall/CRC; 2020. Available from:</w:t>
+      </w:r>
+      <w:r>
+        <w:t xml:space="preserve"> </w:t>
+      </w:r>
+      <w:hyperlink r:id="rId74">
+        <w:r>
+          <w:rPr>
+            <w:rStyle w:val="Hyperlink"/>
+          </w:rPr>
+          <w:t xml:space="preserve">https://bookdown.org/yihui/rmarkdown-cookbook</w:t>
+        </w:r>
+      </w:hyperlink>
+    </w:p>
+    <w:bookmarkEnd w:id="75"/>
+    <w:bookmarkStart w:id="77" w:name="ref-rmarkdown2024"/>
+    <w:p>
+      <w:pPr>
+        <w:pStyle w:val="Bibliography"/>
+      </w:pPr>
+      <w:r>
+        <w:t xml:space="preserve">31.</w:t>
+      </w:r>
+      <w:r>
+        <w:t xml:space="preserve"> </w:t>
+      </w:r>
+      <w:r>
+        <w:t xml:space="preserve">	</w:t>
+      </w:r>
+      <w:r>
+        <w:t xml:space="preserve">Allaire J, Xie Y, Dervieux C, McPherson J, Luraschi J, Ushey K, et al.</w:t>
+      </w:r>
+      <w:r>
+        <w:t xml:space="preserve"> </w:t>
+      </w:r>
+      <w:r>
+        <w:t xml:space="preserve">rmarkdown</w:t>
+      </w:r>
+      <w:r>
+        <w:t xml:space="preserve">: Dynamic documents for r [Internet]. 2024. Available from:</w:t>
+      </w:r>
+      <w:r>
+        <w:t xml:space="preserve"> </w:t>
+      </w:r>
+      <w:hyperlink r:id="rId76">
+        <w:r>
+          <w:rPr>
+            <w:rStyle w:val="Hyperlink"/>
+          </w:rPr>
+          <w:t xml:space="preserve">https://github.com/rstudio/rmarkdown</w:t>
+        </w:r>
+      </w:hyperlink>
+    </w:p>
+    <w:bookmarkEnd w:id="77"/>
+    <w:bookmarkStart w:id="79" w:name="ref-rms"/>
+    <w:p>
+      <w:pPr>
+        <w:pStyle w:val="Bibliography"/>
+      </w:pPr>
+      <w:r>
+        <w:t xml:space="preserve">32.</w:t>
+      </w:r>
+      <w:r>
+        <w:t xml:space="preserve"> </w:t>
+      </w:r>
+      <w:r>
+        <w:t xml:space="preserve">	</w:t>
+      </w:r>
+      <w:r>
+        <w:t xml:space="preserve">Harrell Jr FE.</w:t>
+      </w:r>
+      <w:r>
+        <w:t xml:space="preserve"> </w:t>
+      </w:r>
+      <w:r>
+        <w:t xml:space="preserve">rms</w:t>
+      </w:r>
+      <w:r>
+        <w:t xml:space="preserve">: Regression modeling strategies [Internet]. 2025. Available from:</w:t>
+      </w:r>
+      <w:r>
+        <w:t xml:space="preserve"> </w:t>
+      </w:r>
+      <w:hyperlink r:id="rId78">
+        <w:r>
+          <w:rPr>
+            <w:rStyle w:val="Hyperlink"/>
+          </w:rPr>
+          <w:t xml:space="preserve">https://CRAN.R-project.org/package=rms</w:t>
+        </w:r>
+      </w:hyperlink>
+    </w:p>
+    <w:bookmarkEnd w:id="79"/>
+    <w:bookmarkStart w:id="81" w:name="ref-tidyverse"/>
+    <w:p>
+      <w:pPr>
+        <w:pStyle w:val="Bibliography"/>
+      </w:pPr>
+      <w:r>
+        <w:t xml:space="preserve">33.</w:t>
+      </w:r>
+      <w:r>
+        <w:t xml:space="preserve"> </w:t>
+      </w:r>
+      <w:r>
+        <w:t xml:space="preserve">	</w:t>
+      </w:r>
+      <w:r>
+        <w:t xml:space="preserve">Wickham H, Averick M, Bryan J, Chang W, McGowan LD, François R, et al.</w:t>
+      </w:r>
+      <w:r>
+        <w:t xml:space="preserve"> </w:t>
+      </w:r>
+      <w:hyperlink r:id="rId80">
+        <w:r>
+          <w:rPr>
+            <w:rStyle w:val="Hyperlink"/>
+          </w:rPr>
+          <w:t xml:space="preserve">Welcome to the</w:t>
+        </w:r>
+        <w:r>
+          <w:rPr>
+            <w:rStyle w:val="Hyperlink"/>
+          </w:rPr>
+          <w:t xml:space="preserve"> </w:t>
+        </w:r>
+        <w:r>
+          <w:rPr>
+            <w:rStyle w:val="Hyperlink"/>
+          </w:rPr>
+          <w:t xml:space="preserve">tidyverse</w:t>
+        </w:r>
+      </w:hyperlink>
+      <w:r>
+        <w:t xml:space="preserve">. Journal of Open Source Software. 2019;4(43):1686.</w:t>
+      </w:r>
+      <w:r>
+        <w:t xml:space="preserve"> </w:t>
+      </w:r>
+    </w:p>
+    <w:bookmarkEnd w:id="81"/>
+    <w:bookmarkEnd w:id="82"/>
+    <w:bookmarkEnd w:id="83"/>
     <w:sectPr/>
   </w:body>
 </w:document>

</xml_diff>